<commit_message>
Editorial revision: status wording and Annex B title
</commit_message>
<xml_diff>
--- a/CTRES_v1.0.docx
+++ b/CTRES_v1.0.docx
@@ -15,7 +15,7 @@
           <w:sz w:val="16"/>
           <w:szCs w:val="16"/>
         </w:rPr>
-        <w:t xml:space="preserve">DRAFT FOR CONSULTATION — AN OPEN STANDARD, NOT A PUBLICATION OF ANY REGULATORY AUTHORITY</w:t>
+        <w:t xml:space="preserve">DRAFT FOR CONSULTATION — AN INDEPENDENT OPEN STANDARD</w:t>
       </w:r>
     </w:p>
     <w:p>
@@ -228,7 +228,7 @@
                 <w:sz w:val="18"/>
                 <w:szCs w:val="18"/>
               </w:rPr>
-              <w:t xml:space="preserve">Draft for consultation. Carries no regulatory force and is not endorsed by any authority.</w:t>
+              <w:t xml:space="preserve">Open draft for consultation with authorities and industry. An independent standard: it carries no regulatory force and creates no new obligations.</w:t>
             </w:r>
           </w:p>
         </w:tc>
@@ -1110,7 +1110,7 @@
           <w:sz w:val="20"/>
           <w:szCs w:val="20"/>
         </w:rPr>
-        <w:t xml:space="preserve">Indicative jurisdiction profiles</w:t>
+        <w:t xml:space="preserve">Jurisdiction profiles</w:t>
       </w:r>
     </w:p>
     <w:p>
@@ -1426,7 +1426,7 @@
           <w:sz w:val="20"/>
           <w:szCs w:val="20"/>
         </w:rPr>
-        <w:t xml:space="preserve">It is not endorsed by any authority. Every reference to a jurisdiction’s rules is a reading of published sources, offered for correction.</w:t>
+        <w:t xml:space="preserve">It is independent of any authority. Every reference to a jurisdiction’s rules is a reading of published sources, offered to the authority concerned for review.</w:t>
       </w:r>
     </w:p>
     <w:p>
@@ -1528,7 +1528,7 @@
           <w:sz w:val="20"/>
           <w:szCs w:val="20"/>
         </w:rPr>
-        <w:t xml:space="preserve">Jurisdiction profiles. Thresholds, windows, permitted rails, deadlines and retention periods are no longer written into the records; they are parameters of a profile (§5). Indicative profiles for sixty-seven jurisdictions are in Annex B.</w:t>
+        <w:t xml:space="preserve">Jurisdiction profiles. Thresholds, windows, permitted rails, deadlines and retention periods are no longer written into the records; they are parameters of a profile (§5). Profiles for sixty-seven jurisdictions, researched from published sources, are in Annex B.</w:t>
       </w:r>
     </w:p>
     <w:p>
@@ -10697,7 +10697,7 @@
           <w:sz w:val="20"/>
           <w:szCs w:val="20"/>
         </w:rPr>
-        <w:t xml:space="preserve">A profile is a short configuration, in the machine-readable structure defined by the schema (Annex A), that turns the neutral record model into one authority’s rule set. It contains parameters only and never adds fields. The table lists the parameters, with examples drawn from the indicative profiles in Annex B.</w:t>
+        <w:t xml:space="preserve">A profile is a short configuration, in the machine-readable structure defined by the schema (Annex A), that turns the neutral record model into one authority’s rule set. It contains parameters only and never adds fields. The table lists the parameters, with examples drawn from the profiles in Annex B.</w:t>
       </w:r>
     </w:p>
     <w:tbl>
@@ -11773,7 +11773,7 @@
           <w:sz w:val="20"/>
           <w:szCs w:val="20"/>
         </w:rPr>
-        <w:t xml:space="preserve">Profiles belong to the authorities. The editor publishes a profile as confirmed only when the authority concerned has reviewed it; until then it is marked indicative, as every profile in Annex B is today. Where a federal or provincial system has several licensing bodies, a profile may inherit from a shared base and override only what differs, so that provinces or states agree the common part once.</w:t>
+        <w:t xml:space="preserve">Profiles belong to the authorities. The editor publishes a profile as confirmed only when the authority concerned has reviewed it; until then it is marked as researched from published sources, as every profile in Annex B is today. Where a federal or provincial system has several licensing bodies, a profile may inherit from a shared base and override only what differs, so that provinces or states agree the common part once.</w:t>
       </w:r>
     </w:p>
     <w:p>
@@ -15914,7 +15914,7 @@
                 <w:sz w:val="18"/>
                 <w:szCs w:val="18"/>
               </w:rPr>
-              <w:t xml:space="preserve">Authorities review their indicative profiles; corrections adopted as submitted</w:t>
+              <w:t xml:space="preserve">Authorities review their profiles; corrections adopted as submitted</w:t>
             </w:r>
           </w:p>
         </w:tc>
@@ -16226,7 +16226,7 @@
           <w:sz w:val="20"/>
           <w:szCs w:val="20"/>
         </w:rPr>
-        <w:t xml:space="preserve">Is the indicative profile for your jurisdiction in Annex B correct, and what is missing?</w:t>
+        <w:t xml:space="preserve">Is the profile for your jurisdiction in Annex B correct, and what is missing?</w:t>
       </w:r>
     </w:p>
     <w:p>
@@ -16447,7 +16447,7 @@
           <w:sz w:val="28"/>
           <w:szCs w:val="28"/>
         </w:rPr>
-        <w:t xml:space="preserve">Annex B. Indicative jurisdiction profiles</w:t>
+        <w:t xml:space="preserve">Annex B. Jurisdiction profiles</w:t>
       </w:r>
     </w:p>
     <w:p>
@@ -16460,7 +16460,7 @@
           <w:sz w:val="18"/>
           <w:szCs w:val="18"/>
         </w:rPr>
-        <w:t xml:space="preserve">Readings of published sources as at 2 October 2026, summarised to the parameters in §5 and grouped by region. They are not legal advice and have not been confirmed by any authority. “Not found” means that no published rule was located, not that none exists; “to be confirmed” marks a reading the sources did not settle. Each row is offered to the authority concerned for correction, and a corrected row replaces this one as submitted.</w:t>
+        <w:t xml:space="preserve">Readings of published sources as at 2 October 2026, summarised to the parameters in §5 and grouped by region. They are a reference, not legal advice. “Not found” means that no published rule was located, not that none exists; “to be confirmed” marks a reading the sources did not settle. Each row is offered to the authority concerned for review, and a corrected row replaces this one as submitted.</w:t>
       </w:r>
     </w:p>
     <w:tbl>
@@ -30230,7 +30230,7 @@
                 <w:sz w:val="18"/>
                 <w:szCs w:val="18"/>
               </w:rPr>
-              <w:t xml:space="preserve">Any, through profiles (§5); sixty-seven indicative profiles (Annex B)</w:t>
+              <w:t xml:space="preserve">Any, through profiles (§5); sixty-seven profiles researched from published sources (Annex B)</w:t>
             </w:r>
           </w:p>
         </w:tc>

</xml_diff>

<commit_message>
Annex B revision v1.0.2
Claude-Session: https://claude.ai/code/session_01DyJMvJuV4yPYAKQBsVxH7y
</commit_message>
<xml_diff>
--- a/CTRES_v1.0.docx
+++ b/CTRES_v1.0.docx
@@ -281,7 +281,7 @@
                 <w:sz w:val="18"/>
                 <w:szCs w:val="18"/>
               </w:rPr>
-              <w:t xml:space="preserve">2 October 2026 (revised for publication 5 October 2026)</w:t>
+              <w:t xml:space="preserve">2 October 2026 (Annex B revision v1.0.2, 13 October 2026)</w:t>
             </w:r>
           </w:p>
         </w:tc>
@@ -16460,7 +16460,7 @@
           <w:sz w:val="18"/>
           <w:szCs w:val="18"/>
         </w:rPr>
-        <w:t xml:space="preserve">Readings of published sources as at 2 October 2026, summarised to the parameters in §5 and grouped by region. They are a reference, not legal advice. “Not found” means that no published rule was located, not that none exists; “to be confirmed” marks a reading the sources did not settle. Each row is offered to the authority concerned for review, and a corrected row replaces this one as submitted.</w:t>
+        <w:t xml:space="preserve">Readings of published sources as at 2 October 2026, re-verified against the primary instruments and updated 13 October 2026 (release v1.0.2), summarised to the parameters in §5 and grouped by region. They are a reference, not legal advice. “Not found” means that no published rule was located, not that none exists. Each row is offered to the authority concerned for review, and a corrected row replaces this one as submitted; rows marked reviewed carry the authority’s own wording.</w:t>
       </w:r>
     </w:p>
     <w:tbl>
@@ -16716,7 +16716,7 @@
                 <w:sz w:val="14"/>
                 <w:szCs w:val="14"/>
               </w:rPr>
-              <w:t xml:space="preserve">United Kingdom — Gambling Commission</w:t>
+              <w:t xml:space="preserve">United Kingdom — Gambling Commission (Gambling Act 2005; LCCP; RTS), also the AML supervisory authority for casinos, remote included (MLR 2017 reg 7(1)(d)); National Crime Agency (UKFIU) receives suspicious activity reports (POCA 2002 Part 7).</w:t>
             </w:r>
           </w:p>
         </w:tc>
@@ -16742,7 +16742,7 @@
                 <w:sz w:val="14"/>
                 <w:szCs w:val="14"/>
               </w:rPr>
-              <w:t xml:space="preserve">Credit cards banned since April 2020, including credit-funded e-wallets. Virtual assets not prohibited by statute; no licensee approved in practice; the Commission began exploring a possible route in 2026, linked to the FCA crypto regime.</w:t>
+              <w:t xml:space="preserve">Credit cards banned from 14 April 2020, also via a money service business (LCCP 6.1.2); e-wallets not loaded from a credit card (guidance). Payment services only via authorised PSPs (LCCP 5.1.2). Virtual assets not prohibited; 'digital currencies' are cash equivalents (LCCP 5.1.1); crypto High risk (2026 risk assessment); Commission exploring a route (May 2026); no licensee acceptance found.</w:t>
             </w:r>
           </w:p>
         </w:tc>
@@ -16768,7 +16768,7 @@
                 <w:sz w:val="14"/>
                 <w:szCs w:val="14"/>
               </w:rPr>
-              <w:t xml:space="preserve">No explicit closed-loop rule; payment methods not in the customer’s name and open-loop systems rated high risk (2026 risk assessment). Financial limit prompted before first deposit.</w:t>
+              <w:t xml:space="preserve">No closed-loop rule found (LCCP, RTS, AML guidance searched); 'lack of closed-loop system' and payment methods not in the customer's name rated High risk (2026 risk assessment). Identity verified before gambling (LCCP 17.1.1). Limit prompt at registration or first deposit, limit the default (RTS 12A, 12E, from 31 Oct 2025); gross deposit limits per 24 h, 7 days, month (RTS 12B, from 30 Sep 2026).</w:t>
             </w:r>
           </w:p>
         </w:tc>
@@ -16794,7 +16794,7 @@
                 <w:sz w:val="14"/>
                 <w:szCs w:val="14"/>
               </w:rPr>
-              <w:t xml:space="preserve">Due diligence at €2,000 for remote casino. Financial vulnerability checks on net deposits over 30 days; staged financial risk assessments announced July 2026. Suspicious activity reports to the NCA.</w:t>
+              <w:t xml:space="preserve">Casino CDD at £2,000 (MLR reg 27(5); sterling from 30 June 2026 by SI 2026/621, was EUR 2,000), deposits and withdrawals. Vulnerability check when deposits minus withdrawals exceed £150 in 30 days (SR 3.4.4, from 28 Feb 2025). Staged financial risk assessments announced July 2026 (stage one £5,000 net in 24 h; no start date). SARs to the NCA (POCA 2002). Slots stake £5, £2 under 25 (SI 2025/215).</w:t>
             </w:r>
           </w:p>
         </w:tc>
@@ -16820,7 +16820,7 @@
                 <w:sz w:val="14"/>
                 <w:szCs w:val="14"/>
               </w:rPr>
-              <w:t xml:space="preserve">Segregation and disclosure of a protection rating (not protected, medium, high), shown at first deposit.</w:t>
+              <w:t xml:space="preserve">Remote licensees hold customer funds in a separate client bank account (LCCP 4.1.1). Insolvency protection rating disclosed in terms and acknowledged at first deposit: not protected (segregation only is the remote minimum), medium, high (LCCP 4.2.1; Commission ratings system). 'Not protected' customers reminded every six months, stating the value held (LCCP 4.2.1(3), from 31 Oct 2025).</w:t>
             </w:r>
           </w:p>
         </w:tc>
@@ -16846,7 +16846,7 @@
                 <w:sz w:val="14"/>
                 <w:szCs w:val="14"/>
               </w:rPr>
-              <w:t xml:space="preserve">Quarterly regulatory returns. Retention 5 years.</w:t>
+              <w:t xml:space="preserve">Quarterly regulatory returns within 28 days of quarter end (LCCP 15.3.1; all operators from 1 July 2024). Key events within 5 working days, incl. POCA disclosures, banking, payment methods and processors (LCCP 15.2.1); MLR breaches as soon as practicable (15.2.3). AML records 5 years after the relationship ends (MLR reg 40(3), casinos). Complaints: ADR after 8 weeks, free (SR 6.1.1).</w:t>
             </w:r>
           </w:p>
         </w:tc>
@@ -16878,7 +16878,7 @@
                 <w:sz w:val="14"/>
                 <w:szCs w:val="14"/>
               </w:rPr>
-              <w:t xml:space="preserve">Ireland — Gambling Regulatory Authority</w:t>
+              <w:t xml:space="preserve">Ireland — Gambling Regulatory Authority of Ireland (GRAI; Gambling Regulation Act 2024 Part 2; from 5 March 2025). AML supervisor of gambling service providers: Minister for Justice (AML Compliance Unit), CJA (ML/TF) Act 2010; GRA 2024 s. 230 (GRAI role) not commenced. STRs to FIU Ireland and Revenue (CJA s. 42). GRAI betting licences from 9 Feb 2026; Betting Act 1931 licences run to expiry (s. 235).</w:t>
             </w:r>
           </w:p>
         </w:tc>
@@ -16905,7 +16905,7 @@
                 <w:sz w:val="14"/>
                 <w:szCs w:val="14"/>
               </w:rPr>
-              <w:t xml:space="preserve">Credit cards and credit-funded digital payments prohibited (s.165, Gambling Regulation Act 2024); buy-now-pay-later excluded by guidance. Virtual assets not addressed in the Act; national AML action plan targets a standard on crypto as a source of funds by Q2 2027.</w:t>
+              <w:t xml:space="preserve">Credit cards, credit facilities and e-/digital payments loaded from a credit card prohibited (GRA 2024 s. 165, in force 5 Feb 2026, S.I. 31/2026); Authority may bar other payment forms by regulations (s. 165(3)); none found. BNPL guidance not found. Virtual assets not addressed in the Act; Dept of Finance NRA 2026 action plan: GRAI standard on crypto as a source of funds by Q2 2027 (policy).</w:t>
             </w:r>
           </w:p>
         </w:tc>
@@ -16932,7 +16932,7 @@
                 <w:sz w:val="14"/>
                 <w:szCs w:val="14"/>
               </w:rPr>
-              <w:t xml:space="preserve">Closed-loop payouts planned in the national AML action plan (target Q2 2027; not yet law). Monetary limit tool; excess refunded within 7 days (s.164).</w:t>
+              <w:t xml:space="preserve">Closed loop: NRA 2026 plan, Q2 2027; not law. No own-name payment rule found. ID and age verified before account opening (s. 169; S.I. 315/2026). Limit facility; excess refunded within 7 days (s. 164). Deposit caps by regulations (s. 170); none. Winnings not unreasonably withheld, no deadline (s. 155). Balance refunded on closure (s. 171). Exclusion Register refund in 7 days (s. 45; not in force).</w:t>
             </w:r>
           </w:p>
         </w:tc>
@@ -16959,7 +16959,7 @@
                 <w:sz w:val="14"/>
                 <w:szCs w:val="14"/>
               </w:rPr>
-              <w:t xml:space="preserve">Due diligence at €2,000. Suspicious transaction reports to FIU Ireland (goAML) and to Revenue.</w:t>
+              <w:t xml:space="preserve">CDD before an occasional transaction of EUR 2,000 or more in aggregate, money paid to or by the provider, single or linked transactions (CJA 2010 s. 24(1), s. 33(1)(b); S.I. 487/2018 reg 4 for providers of gambling services; private members' clubs s. 25(1)(h)). STRs as soon as practicable to FIU Ireland (goAML Web) and to the Revenue Commissioners (ROS) (CJA s. 42).</w:t>
             </w:r>
           </w:p>
         </w:tc>
@@ -16986,7 +16986,7 @@
                 <w:sz w:val="14"/>
                 <w:szCs w:val="14"/>
               </w:rPr>
-              <w:t xml:space="preserve">Authority may make rules on segregated customer accounts (s.136); none made yet.</w:t>
+              <w:t xml:space="preserve">B2C licensees must hold relevant funds (account-holder money, pending payments, unpaid winnings) in a single Segregated Customer Account at a regulated financial service provider, accessed only in listed cases (GRA 2024 s. 135, in force 5 Feb 2026). Authority may prescribe account type, records, retention, audit, deficit make-good (s. 136); none found. s. 152 records power excludes these accounts.</w:t>
             </w:r>
           </w:p>
         </w:tc>
@@ -17013,7 +17013,7 @@
                 <w:sz w:val="14"/>
                 <w:szCs w:val="14"/>
               </w:rPr>
-              <w:t xml:space="preserve">Record-keeping rules consulted July–August 2026. Retention 5 years, extendable.</w:t>
+              <w:t xml:space="preserve">Authority may prescribe records and accounts and their form (s. 152); none found; no 2026 record-keeping consultation found on grai.ie. Account-holder register: name, address, date of birth (s. 168). Alerts on wins, losses, time at set intervals; balance and amounts paid viewable (s. 173); none prescribed. AML records 5 years after relationship or last transaction; Garda may add 5 (CJA s. 55).</w:t>
             </w:r>
           </w:p>
         </w:tc>
@@ -17206,7 +17206,7 @@
                 <w:sz w:val="14"/>
                 <w:szCs w:val="14"/>
               </w:rPr>
-              <w:t xml:space="preserve">Isle of Man — Gambling Supervision Commission</w:t>
+              <w:t xml:space="preserve">Isle of Man — Gambling Supervision Commission (GSC) licenses under the Online Gambling Regulation Act 2001 and supervises AML/CFT under the Gambling (AML/CFT) Act 2018 and Code 2019; disclosures to the Isle of Man FIU. Gambling Legislation (Amendment) Bill 2026 passed Tynwald 28 April 2026; Royal Assent and commencement not confirmed at 8 October 2026.</w:t>
             </w:r>
           </w:p>
         </w:tc>
@@ -17233,7 +17233,7 @@
                 <w:sz w:val="14"/>
                 <w:szCs w:val="14"/>
               </w:rPr>
-              <w:t xml:space="preserve">No credit-card ban found. Virtual assets only under five GSC-approved models (licensing requirements, October 2025); crypto in, fiat out not permitted.</w:t>
+              <w:t xml:space="preserve">No credit-card ban found; GSC approves every payment method in the operator's payment schematic; no cash for online gambling (Code 2019 para 29(1)). Virtual currency allowed since 1 January 2017 (Online Gambling (Amendments) Regulations 2016, deposits in money's worth) under five GSC pre-approved models (Licensing Requirements, October 2025); crypto in, fiat out not permitted.</w:t>
             </w:r>
           </w:p>
         </w:tc>
@@ -17260,7 +17260,7 @@
                 <w:sz w:val="14"/>
                 <w:szCs w:val="14"/>
               </w:rPr>
-              <w:t xml:space="preserve">Same coin in, same coin out (BTC in, BTC out). Winnings to the customer, or to a third party on the customer’s written instruction.</w:t>
+              <w:t xml:space="preserve">Same coin in, same coin out (BTC in, BTC out). Online winnings paid only to a card account or other facility from which the customer previously deposited and which the operator is satisfied still belongs exclusively to the customer, or to a facility the operator is satisfied will reach the customer exclusively (Code 2019 para 29(2)). Payout deadline: not found.</w:t>
             </w:r>
           </w:p>
         </w:tc>
@@ -17287,7 +17287,7 @@
                 <w:sz w:val="14"/>
                 <w:szCs w:val="14"/>
               </w:rPr>
-              <w:t xml:space="preserve">Identification at account opening; verification once deposits or withdrawals reach €3,000 within 30 days (AML/CFT Code 2019). Suspicious reports to the Isle of Man FIU through Themis.</w:t>
+              <w:t xml:space="preserve">Identification at account opening (Code 2019 para 10); verification before a deposit or withdrawal that takes the customer over EUR 3,000 (or equivalent) in 30 days, or EUR 3,000 in single or linked occasional transactions (para 11); virtual assets valued in EUR at transaction time. Disclosures to the Isle of Man FIU through Themis as soon as practicable (paras 22-24).</w:t>
             </w:r>
           </w:p>
         </w:tc>
@@ -17314,7 +17314,7 @@
                 <w:sz w:val="14"/>
                 <w:szCs w:val="14"/>
               </w:rPr>
-              <w:t xml:space="preserve">Segregated from operating funds and held on trust at an Isle of Man bank.</w:t>
+              <w:t xml:space="preserve">Participants' money paid into a client account at a recognised bank (Isle of Man licensed or Treasury-listed overseas deposit taker) and held on trust (Participants' Money Regulations 2010 regs 3, 4, 6); GSC expects an Isle of Man bank unless it gives prior written approval. Bank guarantee, trust, insurance or cash-market funds also accepted; cover equals deposits, unpaid winnings and bonuses.</w:t>
             </w:r>
           </w:p>
         </w:tc>
@@ -17341,7 +17341,7 @@
                 <w:sz w:val="14"/>
                 <w:szCs w:val="14"/>
               </w:rPr>
-              <w:t xml:space="preserve">Registration and gaming servers on the Island. Retention 5 years.</w:t>
+              <w:t xml:space="preserve">Player registration and gameplay servers in the Isle of Man (software-only suppliers excepted). Quarterly return to the GSC by the 21st after quarter end (player fund cover, SARs, deposits and withdrawals by fiat, VC and VG). Retention 5 years from the transaction or end of relationship, even after the licence ends; transaction logs backed up daily. No central self-exclusion register found.</w:t>
             </w:r>
           </w:p>
         </w:tc>
@@ -17534,7 +17534,7 @@
                 <w:sz w:val="14"/>
                 <w:szCs w:val="14"/>
               </w:rPr>
-              <w:t xml:space="preserve">Malta — Malta Gaming Authority; FIAU</w:t>
+              <w:t xml:space="preserve">Malta — Malta Gaming Authority (Gaming Act, Cap. 583, Art 5; binding instruments under Art 7(2)); Financial Intelligence Analysis Unit (FIAU) receives suspicious transaction reports and supervises AML/CFT (Prevention of Money Laundering Act, Cap. 373, Arts 15-16, 26; PMLFTR, S.L. 373.01). FIAU Implementing Procedures Part II for remote gaming issued with the MGA.</w:t>
             </w:r>
           </w:p>
         </w:tc>
@@ -17561,7 +17561,7 @@
                 <w:sz w:val="14"/>
                 <w:szCs w:val="14"/>
               </w:rPr>
-              <w:t xml:space="preserve">Only payment providers notified to the MGA. Virtual assets permitted under the MGA DLT Policy through VFA-authorised providers; privacy coins excluded; withdrawals in the currency deposited.</w:t>
+              <w:t xml:space="preserve">Payments only via payment providers notified to the MGA and not objected to (Directive 3 of 2018, Art 45); new payment methods notified within 30 days (Art 37). No credit (Directive 2, Art 27). Virtual financial assets only with prior MGA approval (DLT Policy, Jan 2023); VFAs with inbuilt anonymisation functions prohibited; third-party wallet or exchange providers, if used, VFA Act authorised.</w:t>
             </w:r>
           </w:p>
         </w:tc>
@@ -17588,7 +17588,7 @@
                 <w:sz w:val="14"/>
                 <w:szCs w:val="14"/>
               </w:rPr>
-              <w:t xml:space="preserve">Withdrawals to the source account “where possible”, within 5 working days.</w:t>
+              <w:t xml:space="preserve">Withdrawals 'where possible' to the account the funds came from, otherwise to the player in line with AML law (Directive 2, Art 29(2)); paid within 5 working days 'if practicable' (Art 29(1)); time allowed for identity checks and CDD (Art 29(3)); AML or fraud delay or block (Art 30(2)); any withdrawal limit at least EUR 250 a month, deposits never restricted (Art 30(1)). No same-name rule found.</w:t>
             </w:r>
           </w:p>
         </w:tc>
@@ -17615,7 +17615,7 @@
                 <w:sz w:val="14"/>
                 <w:szCs w:val="14"/>
               </w:rPr>
-              <w:t xml:space="preserve">Due diligence at €2,000 over a rolling 180 days. Suspicious transaction reports through goAML.</w:t>
+              <w:t xml:space="preserve">CDD when transactions reach EUR 2,000 (PMLFTR, S.L. 373.01, reg 9(1)). FIAU Implementing Procedures Part II: counted on deposits only, either daily since the relationship began or over a rolling 180 days; CDD not completed within 30 days of the threshold ends the relationship. STRs to the FIAU via goAML (reg 15); transaction held 1 working day after filing. No large-transaction report found.</w:t>
             </w:r>
           </w:p>
         </w:tc>
@@ -17642,7 +17642,7 @@
                 <w:sz w:val="14"/>
                 <w:szCs w:val="14"/>
               </w:rPr>
-              <w:t xml:space="preserve">Legally separate from the operator’s assets; balance at least equal to liabilities, at least 90% in the account and the rest in transit.</w:t>
+              <w:t xml:space="preserve">Distinct patrimony, segregated, no creditor claim (S.L. 583.08, regs 4, 6, 7; Directive 2, Art 37). Held at an MGA-approved credit, financial or payment institution; trusts, guarantees, reserve accounts may be imposed (Art 31). Balance with funds in transit covers player balances, 90% or more in the account, shortfall made good forthwith (Art 38). Changes need prior approval (Directive 3, Art 38).</w:t>
             </w:r>
           </w:p>
         </w:tc>
@@ -17669,7 +17669,7 @@
                 <w:sz w:val="14"/>
                 <w:szCs w:val="14"/>
               </w:rPr>
-              <w:t xml:space="preserve">Monthly player-funds report with evidence; real-time mirror of essential regulatory data. Retention 5 years.</w:t>
+              <w:t xml:space="preserve">Monthly player funds report within 20 days of month end with back-end screenshots, bank/PSP statements, merchant screenshots (Directive 3, Art 39; MGA), plus failed VFA deposits/withdrawals (DLT Policy 2.8). Live or real-time mirror server of essential regulatory data (Art 17(4)). Annual auditor AUP on player funds (Art 41). AML records 5 years (PMLFTR reg 13); audit logs 2 years (Art 16(6)).</w:t>
             </w:r>
           </w:p>
         </w:tc>
@@ -19012,7 +19012,7 @@
                 <w:sz w:val="14"/>
                 <w:szCs w:val="14"/>
               </w:rPr>
-              <w:t xml:space="preserve">Germany — Gemeinsame Glücksspielbehörde der Länder</w:t>
+              <w:t xml:space="preserve">Germany — Gemeinsame Glücksspielbehörde der Länder (GGL), public-law body in Halle (Saale), set up 1 July 2021 under the GlüStV 2021; licenses and supervises online sports betting, virtual slots and poker, runs LUGAS since 1 Jan 2023 and is their GwG supervisor (§ 50 Nr. 8 GwG). OASIS exclusion file run by Regierungspräsidium Darmstadt (§ 8). FIU at the Generalzolldirektion receives STRs (§ 43 GwG).</w:t>
             </w:r>
           </w:p>
         </w:tc>
@@ -19038,7 +19038,7 @@
                 <w:sz w:val="14"/>
                 <w:szCs w:val="14"/>
               </w:rPr>
-              <w:t xml:space="preserve">Direct debit, bank transfer or a card in the player’s name; anonymous instruments banned; virtual assets not permitted.</w:t>
+              <w:t xml:space="preserve">Deposits and payouts only via a payment account in the player's name at a bank, payment or e-money institution; anonymous instruments banned (§ 6b(4)); GwG § 16(4): direct debit, transfer or card in the player's name; exception EUR 25 single / EUR 100 a month; no interest (§ 16(3)). No loans (§ 4(5)). Virtual assets: not found. GGL can bar banks and PSPs from illegal-gambling payments (§ 9(1)).</w:t>
             </w:r>
           </w:p>
         </w:tc>
@@ -19064,7 +19064,7 @@
                 <w:sz w:val="14"/>
                 <w:szCs w:val="14"/>
               </w:rPr>
-              <w:t xml:space="preserve">Player and payment-account names must match; payouts by the same method to the player’s account.</w:t>
+              <w:t xml:space="preserve">Payment account in the player's name (§ 6b(4)); no play or payout before identity verified (§ 6a(4)); transfers between player accounts banned (§ 6b(5)). Payouts only to the player's own account, via the § 16(4) methods, with a purpose text (GwG § 16(7)); no same-method rule in the GlüStV. Closing balance paid within 5 working days, no fees (§ 6b(7)); player-set automatic payout offered (§ 6b(3)).</w:t>
             </w:r>
           </w:p>
         </w:tc>
@@ -19090,7 +19090,7 @@
                 <w:sz w:val="14"/>
                 <w:szCs w:val="14"/>
               </w:rPr>
-              <w:t xml:space="preserve">Full due diligence at onboarding; suspicious reports to the FIU through goAML. €1,000 monthly cross-operator deposit limit enforced in real time through LUGAS.</w:t>
+              <w:t xml:space="preserve">No EUR 2,000 threshold online (GwG § 10(5) disapplied by § 16(1)); full CDD before play (§ 6a(4)). STRs to the FIU without delay (§ 43 GwG) via goAML; registration mandatory since 1 Jan 2024 (§ 45(1)). Deposit limit max EUR 1,000 a month cross-operator, checked in the Limitdatei; by permit to EUR 10,000 with proof of means, EUR 30,000 for max 1% of players (GGL rule); increase after 7 days (§ 6c).</w:t>
             </w:r>
           </w:p>
         </w:tc>
@@ -19116,7 +19116,7 @@
                 <w:sz w:val="14"/>
                 <w:szCs w:val="14"/>
               </w:rPr>
-              <w:t xml:space="preserve">Segregated, insolvency-protected account equal to all player balances.</w:t>
+              <w:t xml:space="preserve">Entrusted funds on a non-offsetting account at a credit institution, separate from own funds, protected against insolvency of operator and bank, always equal to the sum of player balances, not usable for third-party claims; confirmed to the authority by a lawyer or tax adviser (§ 6b(6)). Permit security: EUR 5m bank guarantee, up to EUR 50m (§ 4c(3)). Game payments via a German or EU bank (§ 4a).</w:t>
             </w:r>
           </w:p>
         </w:tc>
@@ -19142,7 +19142,7 @@
                 <w:sz w:val="14"/>
                 <w:szCs w:val="14"/>
               </w:rPr>
-              <w:t xml:space="preserve">LUGAS limit and activity file; OASIS exclusion; Safe-Server holding immutable JSON data. AML 5 years.</w:t>
+              <w:t xml:space="preserve">LUGAS (GGL, run by Dataport): Limitdatei (§ 6c) and Aktivitätsdatei against parallel play (§ 6h), checked before deposit and play; OASIS at registration and login (§ 8). Safe-Server: operator-run store of all supervision data, immutable, pseudonymised, direct GGL access (§ 6i(2)); format in unpublished guideline; retention not found. Player data 5 years after closure (§ 6g); AML 5 years (GwG § 8).</w:t>
             </w:r>
           </w:p>
         </w:tc>
@@ -19174,7 +19174,7 @@
                 <w:sz w:val="14"/>
                 <w:szCs w:val="14"/>
               </w:rPr>
-              <w:t xml:space="preserve">Austria — Federal Ministry of Finance</w:t>
+              <w:t xml:space="preserve">Austria — Finanzamt Österreich (Dienststelle für Sonderzuständigkeiten): concessions and supervision since 1 Jan 2021 (GSpG § 14, § 19); BMF: legislation, strategy. Geldwäschemeldestelle (A-FIU) at the Bundeskriminalamt (§ 4 Abs 2 BKA-G). Sports betting: Länder Wettengesetze (W, NÖ, OÖ, Sbg, Stmk, Ktn, T, Vbg; Burgenland not located). Bill 594 d.B.: Finanzamt = Glücksspielaufsichtsbehörde (§ 60 Abs 56).</w:t>
             </w:r>
           </w:p>
         </w:tc>
@@ -19201,7 +19201,7 @@
                 <w:sz w:val="14"/>
                 <w:szCs w:val="14"/>
               </w:rPr>
-              <w:t xml:space="preserve">Online monopoly (one concession). Bill 594 d.B., in Finance Committee (EU standstill to 5 November 2026), would licence online operators from October 2027 and allow payment blocking of unlicensed operators (3 banking days in draft).</w:t>
+              <w:t xml:space="preserve">Federal monopoly (§ 3); one concession covers Elektronische Lotterien (§ 12a, § 14 Abs 6): Österreichische Lotterien / win2day to 30 Sep 2027. No payment-method or virtual-asset rule found. Bill 594 d.B. (5 Aug 2026, in committee; EU standstill): unlimited online concessions, cooling-off 1 Jan 2027, start Oct 2027; PSPs stop payments for banned games in 3 banking days (§ 56e, from 1 Jan 2027).</w:t>
             </w:r>
           </w:p>
         </w:tc>
@@ -19228,7 +19228,7 @@
                 <w:sz w:val="14"/>
                 <w:szCs w:val="14"/>
               </w:rPr>
-              <w:t xml:space="preserve">Not found.</w:t>
+              <w:t xml:space="preserve">No name-match, closed-loop or payout-deadline rule found (GSpG §§ 12a, 14, 16, 31c; bill §§ 13, 14). Payout terms sit in the Spielbedingungen for Elektronische Lotterien, which must regulate 'die Geltendmachung und die Auszahlung der Gewinne' and need prior approval of the Finanzamt Österreich (§ 16 Abs 1, Abs 7 Z 3); not opened.</w:t>
             </w:r>
           </w:p>
         </w:tc>
@@ -19255,7 +19255,7 @@
                 <w:sz w:val="14"/>
                 <w:szCs w:val="14"/>
               </w:rPr>
-              <w:t xml:space="preserve">Due diligence under the AML act; suspicious reports to A-FIU through goAML. Bill: cross-operator deposit limits (draft: €250 weekly under 26, €1,680 monthly from 26).</w:t>
+              <w:t xml:space="preserve">FM-GwG applies via GSpG § 31c. Online (§ 12a Abs 1): identification (FM-GwG § 6) only where the risk analysis shows no low risk (§ 31c Abs 3 Z 2); EUR 2,000 per visitor and day is a casino and VLT trigger (Abs 2 Z 4). STRs 'unverzüglich' to the Geldwäschemeldestelle (FM-GwG § 16) via goAML; 5-year look-back on FIU enquiries. Bill: deposit cap EUR 250 a week under 26, EUR 1,680 a month from 26.</w:t>
             </w:r>
           </w:p>
         </w:tc>
@@ -19282,7 +19282,7 @@
                 <w:sz w:val="14"/>
                 <w:szCs w:val="14"/>
               </w:rPr>
-              <w:t xml:space="preserve">Not found.</w:t>
+              <w:t xml:space="preserve">No segregation or trust rule found (GSpG §§ 12a, 14, 16, 19, 31c; bill §§ 13, 31g-31i). Concession security: Sicherstellung of at least 10 pc of the share capital, mainly for concession and gambling levies (§ 14 Abs 4 Z 2); paid-in capital at least EUR 109m (§ 14 Abs 2 Z 3); Staatskommissär at the concessionaire (§ 19 Abs 2).</w:t>
             </w:r>
           </w:p>
         </w:tc>
@@ -19309,7 +19309,7 @@
                 <w:sz w:val="14"/>
                 <w:szCs w:val="14"/>
               </w:rPr>
-              <w:t xml:space="preserve">Bill: Safe-Server, limit and exclusion registers from 2027. Retention 5 years.</w:t>
+              <w:t xml:space="preserve">Today: VLTs linked to the Bundesrechenzentrum (§ 12a Abs 4); audited accounts to the Finanzamt Österreich within 6 months (§ 19 Abs 4); AML records 10 years after the relationship ends (FM-GwG § 21 via § 31c Abs 3 Z 1). Bill 594 d.B.: Sperrregister (§ 31g), Limitregister (§ 31h), Safe-Server at operator cost (§ 31i); in force 1 Jan 2027 (§ 60 Abs 54); participation start by BMF ordinance.</w:t>
             </w:r>
           </w:p>
         </w:tc>
@@ -19668,7 +19668,7 @@
                 <w:sz w:val="14"/>
                 <w:szCs w:val="14"/>
               </w:rPr>
-              <w:t xml:space="preserve">Sweden — Spelinspektionen</w:t>
+              <w:t xml:space="preserve">Sweden — Spelinspektionen: gambling authority under Spellagen (2018:1138) and Spelförordningen (2018:1475), licenses and supervises, keeps the Spelpaus register, supervises licensees' AML compliance and issues SIFS rules. Finanspolisen (Polismyndigheten) is the FIU: STRs under 4 kap. 3 § Lag (2017:630) go to it via goAML.</w:t>
             </w:r>
           </w:p>
         </w:tc>
@@ -19694,7 +19694,7 @@
                 <w:sz w:val="14"/>
                 <w:szCs w:val="14"/>
               </w:rPr>
-              <w:t xml:space="preserve">Only regulated payment providers; no cash online. Since May 2026 no credit-funded play of any kind: credit cards, invoice, buy-now-pay-later.</w:t>
+              <w:t xml:space="preserve">Deposits only from a payment service provider under the Payment Services Act (13 kap. 5 §); no cash; stakes in SEK (LIFS 2018:2). From 1 May 2026 (SFS 2026:90, 14 kap. 8 §) no credit-financed play: credit cards, invoice or other third-party credit (prop. 2025/26:11). Virtual assets: no rule found; excluded in effect. PSPs must reject MCC 7995 card payments to unlicensed operators (SF 13 kap. 1 §).</w:t>
             </w:r>
           </w:p>
         </w:tc>
@@ -19720,7 +19720,7 @@
                 <w:sz w:val="14"/>
                 <w:szCs w:val="14"/>
               </w:rPr>
-              <w:t xml:space="preserve">No transfers between accounts; balance paid promptly on closure.</w:t>
+              <w:t xml:space="preserve">Deposit card, account or other payment service must belong to the account holder, also after a change (SIFS 2022:3 9 kap. 8 §); one account per licensee; no transfers between accounts (13 kap. 6 §). Temporary account until ID verified: max 1/4 price base amount (SEK 14,800 in 2026), 30 days, no payouts. Closing balance within 5 business days, no fee (SF 10 kap. 2 §). Same-method rule not found.</w:t>
             </w:r>
           </w:p>
         </w:tc>
@@ -19746,7 +19746,7 @@
                 <w:sz w:val="14"/>
                 <w:szCs w:val="14"/>
               </w:rPr>
-              <w:t xml:space="preserve">Mandatory deposit limit; suspicious reports to the Financial Intelligence Unit.</w:t>
+              <w:t xml:space="preserve">Deposit limits per day, week and month set before online play; cut immediate, rise after 72 h; contact above SEK 10,000 a month (14 kap. 7 §; SF 11 kap. 3, 5 §§). CDD at registration and for single or linked stakes or winnings of EUR 2,000 or more (AML Act 3 kap. 5 §). STRs to Finanspolisen without delay (4 kap. 3 §) via goAML. SIFS 2019:2 AML rules; guidance: under SEK 20,000 a year low risk.</w:t>
             </w:r>
           </w:p>
         </w:tc>
@@ -19772,7 +19772,7 @@
                 <w:sz w:val="14"/>
                 <w:szCs w:val="14"/>
               </w:rPr>
-              <w:t xml:space="preserve">Kept separate from the licensee’s own funds.</w:t>
+              <w:t xml:space="preserve">Player balances kept separate from the licensee's own funds (13 kap. 7 §); player told at account opening how funds are protected in insolvency and must specifically accept those terms (LIFS 2018:2 § 7). Prize-pool funds separated (SF 5 kap. 4 §). No guarantee, trust or insurance requirement found (Spellagen, Spelförordningen, LIFS 2018:2 and 2018:5 searched).</w:t>
             </w:r>
           </w:p>
         </w:tc>
@@ -19798,7 +19798,7 @@
                 <w:sz w:val="14"/>
                 <w:szCs w:val="14"/>
               </w:rPr>
-              <w:t xml:space="preserve">Spelpaus checked before any play; gaming system in Sweden unless approved abroad. Retention 5 years.</w:t>
+              <w:t xml:space="preserve">Spelpaus (14 kap. 12 §) checked before play (12 kap. 4 §), at registration and each login (SF 11 kap. 9 §) and before direct marketing, via API (SIFS 2026:3, 1 Aug 2026). Gaming system in Sweden unless allowed abroad with remote access (16 kap. 2 §); no data vault; half-yearly RG statistics. Retention: system data 5 years (16 kap. 5 §); AML 5 years, up to 10. B2B software permit since 1 July 2023.</w:t>
             </w:r>
           </w:p>
         </w:tc>
@@ -19857,7 +19857,7 @@
                 <w:sz w:val="14"/>
                 <w:szCs w:val="14"/>
               </w:rPr>
-              <w:t xml:space="preserve">State monopoly (Norsk Tipping, Norsk Rikstoto); no gambling on credit.</w:t>
+              <w:t xml:space="preserve">State monopoly (Norsk Tipping, Norsk Rikstoto) plus a private market: online and internet-based bingo are licensed; no gambling on credit.</w:t>
             </w:r>
           </w:p>
         </w:tc>
@@ -19884,7 +19884,7 @@
                 <w:sz w:val="14"/>
                 <w:szCs w:val="14"/>
               </w:rPr>
-              <w:t xml:space="preserve">One account per operator, with eID.</w:t>
+              <w:t xml:space="preserve">One account per operator. eID is not a legal requirement but the operators' own choice (most use it). Full identification at registration. Mandatory bet limits (daily and monthly).</w:t>
             </w:r>
           </w:p>
         </w:tc>
@@ -19911,7 +19911,7 @@
                 <w:sz w:val="14"/>
                 <w:szCs w:val="14"/>
               </w:rPr>
-              <w:t xml:space="preserve">Suspicious reports to Økokrim.</w:t>
+              <w:t xml:space="preserve">Suspicious reports to the FIU.</w:t>
             </w:r>
           </w:p>
         </w:tc>
@@ -19938,7 +19938,7 @@
                 <w:sz w:val="14"/>
                 <w:szCs w:val="14"/>
               </w:rPr>
-              <w:t xml:space="preserve">Not found.</w:t>
+              <w:t xml:space="preserve">Gambling operators keep a separate gambling account for each gambler; gamblers have an overview of their transactions and gambling activity.</w:t>
             </w:r>
           </w:p>
         </w:tc>
@@ -19965,7 +19965,7 @@
                 <w:sz w:val="14"/>
                 <w:szCs w:val="14"/>
               </w:rPr>
-              <w:t xml:space="preserve">Banks block payments to unlicensed operators by merchant category and named payment facilitators; DNS blocking. Retention 5 years.</w:t>
+              <w:t xml:space="preserve">Banks block payments to unlicensed operators by merchant category and named payment facilitators; DNS blocking. Retention 5 years. [Reviewed with Lotteritilsynet, October 2026.]</w:t>
             </w:r>
           </w:p>
         </w:tc>
@@ -19996,7 +19996,7 @@
                 <w:sz w:val="14"/>
                 <w:szCs w:val="14"/>
               </w:rPr>
-              <w:t xml:space="preserve">Finland — Lupa- ja valvontavirasto</w:t>
+              <w:t xml:space="preserve">Finland — Poliisihallitus (National Police Board) supervises and licenses until 30 June 2027 [Arpajaislaki 1047/2001; Rahapelilaki 10/2026 s. 106]; Lupa- ja valvontavirasto from 1 July 2027 [s. 57]; Ministry of the Interior (game rules and decrees); AML supervisor of gambling: Poliisihallitus [Rahanpesulaki 444/2017 ch. 7 s. 1]; FIU: Rahanpesun selvittelykeskus (NBI).</w:t>
             </w:r>
           </w:p>
         </w:tc>
@@ -20022,7 +20022,7 @@
                 <w:sz w:val="14"/>
                 <w:szCs w:val="14"/>
               </w:rPr>
-              <w:t xml:space="preserve">Licensed online betting and casino from July 2027 (monopoly until then); no credit-funded play; daily and monthly transfer caps.</w:t>
+              <w:t xml:space="preserve">Veikkaus monopoly to 30 June 2027; licensed online betting and casino from 1 July 2027 [Rahapelilaki 10/2026]; applications to Poliisihallitus from 1 March 2026. From 1 July 2027: no play on credit or pledge, no loan money passed on (s. 25); player-set daily and monthly bank-to-game-account limits (s. 30). Virtual assets: no acceptance rule found; blocking covers crypto providers (2024).</w:t>
             </w:r>
           </w:p>
         </w:tc>
@@ -20048,7 +20048,7 @@
                 <w:sz w:val="14"/>
                 <w:szCs w:val="14"/>
               </w:rPr>
-              <w:t xml:space="preserve">Account holder and bank-account holder expected to match (to be confirmed); balance paid without delay on closure.</w:t>
+              <w:t xml:space="preserve">Identity verified at registration; play only logged in; personal game account (Rahapelilaki ss. 20, 22, 28, from 1 July 2027; Veikkaus now: one personal account, Arpajaislaki s. 14). Transfers from the player's own bank account (s. 30); no rule that the bank-account holder must match - Parliament asked for one to be assessed (HaVM 28/2025). Balance paid without delay on closure, no fee (s. 23).</w:t>
             </w:r>
           </w:p>
         </w:tc>
@@ -20074,7 +20074,7 @@
                 <w:sz w:val="14"/>
                 <w:szCs w:val="14"/>
               </w:rPr>
-              <w:t xml:space="preserve">Suspicious reports to the FIU of the National Bureau of Investigation.</w:t>
+              <w:t xml:space="preserve">Rahanpesulaki 444/2017: gambling operators are obliged entities (ch. 1 s. 2); customer identified and verified when stakes or winnings reach EUR 2,000, single or linked (ch. 3 s. 2); suspicious transactions reported without delay to the Rahanpesun selvittelykeskus (FIU, NBI) (ch. 4 s. 1); channel (goAML) not verified. No threshold-based routine report found.</w:t>
             </w:r>
           </w:p>
         </w:tc>
@@ -20100,7 +20100,7 @@
                 <w:sz w:val="14"/>
                 <w:szCs w:val="14"/>
               </w:rPr>
-              <w:t xml:space="preserve">Segregated, with disclosure to players.</w:t>
+              <w:t xml:space="preserve">Funds on the game account kept separate from the licence holder's own funds; how they are protected in insolvency told to the player at the latest when the account is opened (Rahapelilaki s. 22(4), from 1 July 2027; Ministry of the Interior may issue a decree on the game account, none found). Guarantee or bond: not found.</w:t>
             </w:r>
           </w:p>
         </w:tc>
@@ -20126,7 +20126,7 @@
                 <w:sz w:val="14"/>
                 <w:szCs w:val="14"/>
               </w:rPr>
-              <w:t xml:space="preserve">Game and account data to the regulator; national self-exclusion register; payment blocking since 2023. Retention 5 years.</w:t>
+              <w:t xml:space="preserve">Game and account data to the authority, kept 5 years (Rahapelilaki s. 45, from 1 Jul 2027); personal data 5 years (s. 36); CDD records 5 years (AML Act ch. 3 s. 3). Self-exclusion by notice to the authority, indefinite bar min 1 year (s. 29). Payment blocking of listed operators from 2023 (Arpajaislaki s. 62 l). Veikkaus: fast-game loss limits EUR 500/day, EUR 2,000/month (SM decree 16.9.2026).</w:t>
             </w:r>
           </w:p>
         </w:tc>
@@ -20158,7 +20158,7 @@
                 <w:sz w:val="14"/>
                 <w:szCs w:val="14"/>
               </w:rPr>
-              <w:t xml:space="preserve">Estonia — Tax and Customs Board</w:t>
+              <w:t xml:space="preserve">Estonia — Tax and Customs Board (Maksu- ja Tolliamet, EMTA): activity licences, operating permits, supervision, blocking. FIU is the Rahapesu Andmebüroo (fiu.ee); from 1 Jan 2026 EMTA needs FIU approval before licensing and the FIU may draw operators' reporting data from EMTA (Gambling Act § 57(4)). Minister of Finance issues the data regulation (määrus nr 26).</w:t>
             </w:r>
           </w:p>
         </w:tc>
@@ -20185,7 +20185,7 @@
                 <w:sz w:val="14"/>
                 <w:szCs w:val="14"/>
               </w:rPr>
-              <w:t xml:space="preserve">Virtual assets not prohibited; several licensees accept them through crypto-provider partners, but must show how a crypto or intermediary payment is proved to come from the player’s account.</w:t>
+              <w:t xml:space="preserve">From 1 Jan 2026 a stake may be money, a monetary obligation or a crypto-asset (Gambling Act § 2(2)); remote stakes must arrive through a credit institution, payment institution, e-money institution or crypto-asset service provider licensed in the EEA (§ 5(3)). Permit application must describe how a crypto or intermediary payment is proved to come from the player's account (EMTA form, Annex 8).</w:t>
             </w:r>
           </w:p>
         </w:tc>
@@ -20212,7 +20212,7 @@
                 <w:sz w:val="14"/>
                 <w:szCs w:val="14"/>
               </w:rPr>
-              <w:t xml:space="preserve">Stakes accepted only from the player’s own account; winnings paid only to the account the player paid in from (licence application requirements).</w:t>
+              <w:t xml:space="preserve">Stakes accepted only from the same player's account; payouts only to the account paid from (§ 53(1)(5)-(6); EMTA form, Annex 8). From 1 Jan 2026 the account is one at a credit institution, payment institution or e-money institution, or cash at the operator's gaming location (§ 53(1)(5)). Operator credit agreements banned (§ 34(1)). One-account rule, payout deadline: not found (full Act searched).</w:t>
             </w:r>
           </w:p>
         </w:tc>
@@ -20239,7 +20239,7 @@
                 <w:sz w:val="14"/>
                 <w:szCs w:val="14"/>
               </w:rPr>
-              <w:t xml:space="preserve">Suspicious, unusual and over-limit cash transaction reports to the FIU through its online reporting system.</w:t>
+              <w:t xml:space="preserve">AML Act (RahaPTS) § 19(3): due diligence when a payout, a stake or both reach EUR 2,000, in one or linked payments within a month. STR, UTR, cash transaction (CTR: cash over EUR 32,000 in one or related transactions) and TFR reports to the FIU, immediately and no later than 2 working days, through the FIU web form into RABIS (rabis-web.fiu.ee) or XML over X-tee.</w:t>
             </w:r>
           </w:p>
         </w:tc>
@@ -20266,7 +20266,7 @@
                 <w:sz w:val="14"/>
                 <w:szCs w:val="14"/>
               </w:rPr>
-              <w:t xml:space="preserve">Not found.</w:t>
+              <w:t xml:space="preserve">No segregation, trust or player-balance guarantee rule found (Gambling Act §§ 1-33¹, EMTA permit pages and forms). Share capital at least EUR 1,000,000 for games of chance incl. remote, EUR 130,000 toto, EUR 25,000 skill games (§ 9); additional reserve of at least one-third of share capital built from at least one-seventh of annual net profit (§ 10). Security deposit (tagatis): not found.</w:t>
             </w:r>
           </w:p>
         </w:tc>
@@ -20293,7 +20293,7 @@
                 <w:sz w:val="14"/>
                 <w:szCs w:val="14"/>
               </w:rPr>
-              <w:t xml:space="preserve">Regulator pulls data from operator systems through the national X-tee exchange layer; self-exclusion list. Retention 5 years.</w:t>
+              <w:t xml:space="preserve">Electronic recording and control system (EAKS) connected to EMTA's system; EMTA requests data over X-tee (EHMA); data list in Minister of Finance Regulation 26. HAMPI restrictions list (§ 39) checked before play; term 6-36 months set by the player. Gambling records kept at least 5 years (§§ 53(3), 54(3)); AML records 5 years (RahaPTS § 47; FIU guidelines 5.2, 5.4). Unlicensed sites blocked.</w:t>
             </w:r>
           </w:p>
         </w:tc>
@@ -20350,7 +20350,7 @@
                 <w:sz w:val="14"/>
                 <w:szCs w:val="14"/>
               </w:rPr>
-              <w:t xml:space="preserve">Settlement through a credit-institution account. Supervision transferred to the tax authority in 2026.</w:t>
+              <w:t xml:space="preserve">Settlement through a credit-institution account; credit cards permitted when the card belongs to the player; payment service providers allowed; every transaction identified to the individual making it. Supervision transferred to the State Revenue Service (VID) in 2026.</w:t>
             </w:r>
           </w:p>
         </w:tc>
@@ -20376,7 +20376,7 @@
                 <w:sz w:val="14"/>
                 <w:szCs w:val="14"/>
               </w:rPr>
-              <w:t xml:space="preserve">No prize paid to an account not used for deposits (to be confirmed).</w:t>
+              <w:t xml:space="preserve">Winnings may not be transferred to an account from which no deposit into the gaming account was made. Land-based: winnings may be paid in cash, identified and reported to the FIU at the reporting thresholds.</w:t>
             </w:r>
           </w:p>
         </w:tc>
@@ -20402,7 +20402,7 @@
                 <w:sz w:val="14"/>
                 <w:szCs w:val="14"/>
               </w:rPr>
-              <w:t xml:space="preserve">Suspicious reports and threshold declarations to the Financial Intelligence Service through goAML.</w:t>
+              <w:t xml:space="preserve">AML standards as across the EU. Suspicious reports and threshold declarations to the Financial Intelligence Service through goAML.</w:t>
             </w:r>
           </w:p>
         </w:tc>
@@ -20428,7 +20428,7 @@
                 <w:sz w:val="14"/>
                 <w:szCs w:val="14"/>
               </w:rPr>
-              <w:t xml:space="preserve">Not found.</w:t>
+              <w:t xml:space="preserve">Held exclusively in a Latvian credit institution or bank account; no requirement to hold them separately.</w:t>
             </w:r>
           </w:p>
         </w:tc>
@@ -20454,7 +20454,7 @@
                 <w:sz w:val="14"/>
                 <w:szCs w:val="14"/>
               </w:rPr>
-              <w:t xml:space="preserve">Self-exclusion register; quarterly statements; domain blocking within 5 working days. Retention 5 years.</w:t>
+              <w:t xml:space="preserve">Self-exclusion register; quarterly statements, and quarterly turnover reports on the VID's demand; operators must give the VID unimpeded remote access to their gaming platforms and the information in them; domain blocking within 5 working days. Retention 5 years. [Reviewed with the State Revenue Service, October 2026.]</w:t>
             </w:r>
           </w:p>
         </w:tc>
@@ -20567,7 +20567,7 @@
                 <w:sz w:val="14"/>
                 <w:szCs w:val="14"/>
               </w:rPr>
-              <w:t xml:space="preserve">Suspicious reports to the FNTT.</w:t>
+              <w:t xml:space="preserve">Identify (unless already established) and verify the client and register the client at a deposit, payout or exchange of cash for chips or chips for cash above EUR 1,000 or the equivalent, in a single or several linked operations. Suspicious reports to the FNTT.</w:t>
             </w:r>
           </w:p>
         </w:tc>
@@ -20621,7 +20621,7 @@
                 <w:sz w:val="14"/>
                 <w:szCs w:val="14"/>
               </w:rPr>
-              <w:t xml:space="preserve">Remote access to operator systems; self-exclusion register; illegal-operator list binding payment providers. System data 5 years.</w:t>
+              <w:t xml:space="preserve">The operator platform must be connected to LAKIS (Slot Machine Control Information System) and must record and transmit to LAKIS, at least every 30 days, the data specified in the Law on Gaming. Remote access to operator systems; self-exclusion register; illegal-operator list binding payment providers. Platform data 8 years from the end of the remote gaming contract (Art. 16(8), from 1 Nov 2025; confirmation asked of the LPT). [Reviewed with the Gaming Control Authority, October 2026.]</w:t>
             </w:r>
           </w:p>
         </w:tc>
@@ -21142,7 +21142,7 @@
                 <w:sz w:val="14"/>
                 <w:szCs w:val="14"/>
               </w:rPr>
-              <w:t xml:space="preserve">Poland — Ministry of Finance</w:t>
+              <w:t xml:space="preserve">Poland — Minister of Finance (minister właściwy do spraw finansów publicznych): betting permits and casino concessions, approval of responsible-gaming rules, Register of domains. National Revenue Administration (KAS): supervision and access to archived data (art. 15d). FIU: Generalny Inspektor Informacji Finansowej (GIIF); gambling operators are obliged institutions (AML Act art. 2(1)(20)).</w:t>
             </w:r>
           </w:p>
         </w:tc>
@@ -21169,7 +21169,7 @@
                 <w:sz w:val="14"/>
                 <w:szCs w:val="14"/>
               </w:rPr>
-              <w:t xml:space="preserve">Online casino a state monopoly; betting licensed. Payments only through authorised payment institutions.</w:t>
+              <w:t xml:space="preserve">All online gambling except betting and promotional lotteries is a state monopoly, run by Totalizator Sportowy (art. 5(1b)); online betting under a Ministry permit (art. 6(3)); .pl domain only (art. 15d(2)). Payment transactions of online games only via payment service providers listed in art. 4(2)(1)-(4), (6), (9) of the Payment Services Act (art. 15e). Credit cards and virtual assets: not found.</w:t>
             </w:r>
           </w:p>
         </w:tc>
@@ -21196,7 +21196,7 @@
                 <w:sz w:val="14"/>
                 <w:szCs w:val="14"/>
               </w:rPr>
-              <w:t xml:space="preserve">Play only through a registered player account; no own-account, third-party or payout-deadline rule found.</w:t>
+              <w:t xml:space="preserve">Registration on a player account or temporary player account is a condition of starting and continuing play; play must stop when the account balance is exhausted; 18+ verification (responsible-gaming rules approved by the Minister, art. 15i). Own-account, third-party payment and payout-deadline rules: not found.</w:t>
             </w:r>
           </w:p>
         </w:tc>
@@ -21223,7 +21223,7 @@
                 <w:sz w:val="14"/>
                 <w:szCs w:val="14"/>
               </w:rPr>
-              <w:t xml:space="preserve">Due diligence at €2,000; suspicious reports to GIIF through its IT system. Cash and transfers over €15,000 reported within 7 days (to be confirmed for operators).</w:t>
+              <w:t xml:space="preserve">Due diligence when stakes placed or winnings collected reach EUR 2,000 (AML Act art. 35(1)(4)). Suspicious-circumstance notifications to GIIF without delay, at latest 2 business days after confirming suspicion (art. 74); above-threshold reports - cash and transfers over EUR 15,000 - within 7 days (art. 72); via SI GIIF (regulation of 4 October 2018). Art. 72 exclusions do not cover gambling.</w:t>
             </w:r>
           </w:p>
         </w:tc>
@@ -21250,7 +21250,7 @@
                 <w:sz w:val="14"/>
                 <w:szCs w:val="14"/>
               </w:rPr>
-              <w:t xml:space="preserve">Security of PLN 480,000 for online betting, as a bank or insurance guarantee or a cash deposit.</w:t>
+              <w:t xml:space="preserve">Financial security of PLN 480,000 for online betting (PLN 40,000 per land-based betting point), protecting players' financial interest and the gaming tax, as a bank or insurance guarantee or a cash deposit on the account named by the authority (art. 63(1), (2a), (3)-(4); Reg. of 23 June 2010). Segregation of player balances: not found.</w:t>
             </w:r>
           </w:p>
         </w:tc>
@@ -21277,7 +21277,7 @@
                 <w:sz w:val="14"/>
                 <w:szCs w:val="14"/>
               </w:rPr>
-              <w:t xml:space="preserve">Register of blocked domains: internet providers block within 48 hours, payment providers stop serving within 30 days. Real-time archiving of game data, kept 5 years from year end. AML retention 5 years.</w:t>
+              <w:t xml:space="preserve">Domain register (hazard.mf.gov.pl) feeds ISP and payment-provider systems; ISPs block in 48 h (art. 15f); payment providers stop in 30 days, fine to PLN 250,000 (arts 15g, 89). Game data archived in real time in PL/EU/EEA, KAS remote access, 5 years (art. 15d). Winnings register at PLN 2,280+, certificates kept 5 years (art. 20); quarterly data by the 21st (art. 79). AML records 5 years (art. 49).</w:t>
             </w:r>
           </w:p>
         </w:tc>
@@ -21308,7 +21308,7 @@
                 <w:sz w:val="14"/>
                 <w:szCs w:val="14"/>
               </w:rPr>
-              <w:t xml:space="preserve">Czech Republic — Ministry of Finance</w:t>
+              <w:t xml:space="preserve">Czech Republic — Ministry of Finance (basic licences, kauce, RVO register, blocklist; gambling department odbor 73). FIU is the Financial Analytical Office (FAÚ).</w:t>
             </w:r>
           </w:p>
         </w:tc>
@@ -21334,7 +21334,7 @@
                 <w:sz w:val="14"/>
                 <w:szCs w:val="14"/>
               </w:rPr>
-              <w:t xml:space="preserve">Cashless, through a registered payment account or instrument in the player’s own name at an EU-authorised provider; cash deposits capped at CZK 10,000 per 24 hours. Virtual assets may not be prizes.</w:t>
+              <w:t xml:space="preserve">Deposits to the online user account only from the registered payment account or instrument held in the player's own name at a provider authorised in the EU or EEA (§ 17e); cash deposits and cash withdrawals capped at CZK 10,000 per 24 hours (§ 17e(6)). Virtual assets may not be prizes (§ 10(6)); no other crypto rule found.</w:t>
             </w:r>
           </w:p>
         </w:tc>
@@ -21360,7 +21360,7 @@
                 <w:sz w:val="14"/>
                 <w:szCs w:val="14"/>
               </w:rPr>
-              <w:t xml:space="preserve">No deposits from, or withdrawals to, any other account. Winnings credited without undue delay, within 30 days of settlement; withdrawals paid promptly and free of charge.</w:t>
+              <w:t xml:space="preserve">No deposits from, or transfers to, any account or instrument other than the registered one (§ 17e(4)-(5)). Winnings paid without undue delay, within 30 days of evaluation (§ 10a). Withdrawals from the user account on request, without delay and free of charge (§ 17i). Ban on operator credit to players not found.</w:t>
             </w:r>
           </w:p>
         </w:tc>
@@ -21386,7 +21386,7 @@
                 <w:sz w:val="14"/>
                 <w:szCs w:val="14"/>
               </w:rPr>
-              <w:t xml:space="preserve">Suspicious reports to the FAÚ through its e-form.</w:t>
+              <w:t xml:space="preserve">AML Act identification when a transaction exceeds EUR 1,000 (§ 7(1)); suspicious transaction reports to the FAÚ without undue delay, immediately in urgent cases (§ 18), through its e-form (data box required).</w:t>
             </w:r>
           </w:p>
         </w:tc>
@@ -21412,7 +21412,7 @@
                 <w:sz w:val="14"/>
                 <w:szCs w:val="14"/>
               </w:rPr>
-              <w:t xml:space="preserve">Security deposit of CZK 30–50 million per online game type.</w:t>
+              <w:t xml:space="preserve">Kauce (security deposit) per game type: CZK 30 million for online betting, totalizator and bingo, CZK 50 million for online lottery, technical and live games (§ 89(5)); held on the Ministry's account at the CNB or as a bank guarantee; covers unpaid state debts and unpaid winnings (§ 89(4)). Segregation of player balances not found.</w:t>
             </w:r>
           </w:p>
         </w:tc>
@@ -21438,7 +21438,7 @@
                 <w:sz w:val="14"/>
                 <w:szCs w:val="14"/>
               </w:rPr>
-              <w:t xml:space="preserve">Daily automated reports; excluded-persons register (self-exclusion, benefit recipients, insolvency) queried by API; blocklist of websites, apps and bank accounts. Account records kept 3 years after closure.</w:t>
+              <w:t xml:space="preserve">Daily automated reporting under vyhláška 10/2019 Sb. (MF pokyn: denní herní výkaznictví); RVO register (§§ 16-16b: benefit recipients, criminal bans, insolvency, maintenance defaulters, execution debtors, self-exclusion) via AISG; blocklist (§§ 84a-84d): ISPs block listed sites, PSPs block payment accounts, apps barred. Verification data 3 years (§ 17c); AML records 10 years (AML Act § 16).</w:t>
             </w:r>
           </w:p>
         </w:tc>
@@ -21470,7 +21470,7 @@
                 <w:sz w:val="14"/>
                 <w:szCs w:val="14"/>
               </w:rPr>
-              <w:t xml:space="preserve">Slovakia — Gambling Regulatory Authority</w:t>
+              <w:t xml:space="preserve">Slovakia — Úrad pre reguláciu hazardných hier (ÚRHH), regulator under Act 30/2019 (§ 1(1)(e), § 77); Ministry of Finance issues the implementing decrees (Decrees 134/2019 and 142/2019). FIU: Finančná spravodajská jednotka (FSJ), an organisational unit of the Police Presidium (Prezídium Policajného zboru), not of the National Crime Agency.</w:t>
             </w:r>
           </w:p>
         </w:tc>
@@ -21497,7 +21497,7 @@
                 <w:sz w:val="14"/>
                 <w:szCs w:val="14"/>
               </w:rPr>
-              <w:t xml:space="preserve">Stakes in cash or cashless; player-account records hold the payment account or card number. From January 2026 payment providers act directly on the regulator’s blacklist, without a court order. Virtual assets: not found.</w:t>
+              <w:t xml:space="preserve">Stakes in cash or cashless (§ 14(8)). Server records each account's payment account or card number, deposits, withdrawals (Decree 142/2019 § 2(2)(b)). ISPs and payment providers block listed sites and accounts on the URHH weekly blacklist, no court order (§ 85, from 1 January 2026). Bank card fees on player-account deposits taxed separately from 2026 (261/2025). Virtual assets: not found.</w:t>
             </w:r>
           </w:p>
         </w:tc>
@@ -21524,7 +21524,7 @@
                 <w:sz w:val="14"/>
                 <w:szCs w:val="14"/>
               </w:rPr>
-              <w:t xml:space="preserve">Winnings paid within 5 business days of the claim (Gambling Act s.14). No own-account or third-party payment rule found.</w:t>
+              <w:t xml:space="preserve">Online play requires registration and a player account; one account per operator; balance refunded on closure (§ 31). Funds deposited above the stake withdrawable after any game (§ 14(8)). Winnings paid within 5 working days of the claim, AML Act aside (§ 14(18)); claim period at least 30 days (§ 14(17)). No loans or credit to players (§ 33(5)); no own-account or third-party payment rule found.</w:t>
             </w:r>
           </w:p>
         </w:tc>
@@ -21551,7 +21551,7 @@
                 <w:sz w:val="14"/>
                 <w:szCs w:val="14"/>
               </w:rPr>
-              <w:t xml:space="preserve">Identification at €1,000; due diligence at €2,000; reports to the FIU of the National Crime Agency.</w:t>
+              <w:t xml:space="preserve">Gambling operators are obliged entities (AML Act 297/2008 § 5(1)(d)). Basic due diligence for a gambling transaction of EUR 2,000 or more, single or linked (§ 10(2)(e)); identification and verification for other transactions of EUR 1,000 or more (§ 10(3)). Unusual transactions, incl. attempts, reported to the FSJ without undue delay (§ 17), only via the goAML web application since 1 January 2025.</w:t>
             </w:r>
           </w:p>
         </w:tc>
@@ -21578,7 +21578,7 @@
                 <w:sz w:val="14"/>
                 <w:szCs w:val="14"/>
               </w:rPr>
-              <w:t xml:space="preserve">Financial guarantee deposited with the regulator, up to €1.5 million depending on the licence.</w:t>
+              <w:t xml:space="preserve">Financial guarantee (finančná zábezpeka) on the URHH account, used only for levies, default interest, URHH funding, fines and payment of winnings (§ 2(t), § 67); EUR 750,000 for online betting or internet-casino games, EUR 1,250,000 for both, EUR 1,500,000 combined with land-based (§ 69). Player-account balance refunded on closure (§ 31(3)). Segregation of player funds: not found.</w:t>
             </w:r>
           </w:p>
         </w:tc>
@@ -21605,7 +21605,7 @@
                 <w:sz w:val="14"/>
                 <w:szCs w:val="14"/>
               </w:rPr>
-              <w:t xml:space="preserve">Server in Slovakia with free online access for the regulator; excluded-persons register. Server data kept at least to the end of the following calendar year, plus two years of backups (Decree 142/2019).</w:t>
+              <w:t xml:space="preserve">Server in Slovakia, free URHH online access (§ 14(21)-(22); Decree 142/2019 § 2). Daily notices of stakes and winnings for internet games, monthly for some lotteries (§ 74; Decree 134/2019). Register of excluded persons (§§ 33-38). Game data on server to end of the next year, backups two prior years (142/2019 § 2(11)); player interface 60 days (§ 12(3)); AML records 5 years (297/2008 § 19(2)).</w:t>
             </w:r>
           </w:p>
         </w:tc>
@@ -21964,7 +21964,7 @@
                 <w:sz w:val="14"/>
                 <w:szCs w:val="14"/>
               </w:rPr>
-              <w:t xml:space="preserve">Bosnia and Herzegovina — entity regulators (Federation; Republika Srpska)</w:t>
+              <w:t xml:space="preserve">Bosnia and Herzegovina — Federation: Federal Ministry of Finance approves, Tax Administration FBiH supervises and runs the on-line monitoring (Zakon o igrama na sreću, Sl. novine FBiH 48/15, 60/15). Republika Srpska: Ministry of Finance licenses, Republička uprava za igre na sreću within it (Zakon o igrama na sreću, Sl. glasnik RS 22/19). AML is state-level: FOO within SIPA (Sl. glasnik BiH 13/24).</w:t>
             </w:r>
           </w:p>
         </w:tc>
@@ -21990,7 +21990,7 @@
                 <w:sz w:val="14"/>
                 <w:szCs w:val="14"/>
               </w:rPr>
-              <w:t xml:space="preserve">Federation: payouts at shops, to the player’s virtual account or registered bank account.</w:t>
+              <w:t xml:space="preserve">Federation online betting: winnings paid at betting shops, to the player's virtual account or to the registered transaction account (Pravilnik, Sl. novine FBiH 59/16, 23/24, Art. 32); deposit methods not listed. RS: players pay electronically, non-cash, through bank accounts at a bank seated in RS (Arts. 89, 92). Crypto: not found in either entity.</w:t>
             </w:r>
           </w:p>
         </w:tc>
@@ -22016,7 +22016,7 @@
                 <w:sz w:val="14"/>
                 <w:szCs w:val="14"/>
               </w:rPr>
-              <w:t xml:space="preserve">Federation: payout to the registered account within 3 days of the request.</w:t>
+              <w:t xml:space="preserve">Federation: payout on written request to the player's transaction account at once, at latest within 3 days (Art. 33); funds returned there after 12 months without a deposit; own-name rule and third-party payments not found; identity verified before registration, no ID photo upload. RS: one account per player; deposits and payouts only for registered players with a virtual account (Arts. 91, 92).</w:t>
             </w:r>
           </w:p>
         </w:tc>
@@ -22042,7 +22042,7 @@
                 <w:sz w:val="14"/>
                 <w:szCs w:val="14"/>
               </w:rPr>
-              <w:t xml:space="preserve">State-level AML law; FIU within SIPA.</w:t>
+              <w:t xml:space="preserve">State AML law (Sl. glasnik BiH 13/24): gambling operators obliged entities (Art. 5); CDD at registration on a betting platform regardless of stake (Art. 19(2)); identification at KM 2,000 or more (Art. 19(4)); KM 30,000 CDD trigger (Art. 12). FIU: FOO within SIPA. STR before execution, immediately (Art. 42); cash transactions of KM 30,000 or more at once, at latest 3 days (Art. 43).</w:t>
             </w:r>
           </w:p>
         </w:tc>
@@ -22068,7 +22068,7 @@
                 <w:sz w:val="14"/>
                 <w:szCs w:val="14"/>
               </w:rPr>
-              <w:t xml:space="preserve">Federation: bank guarantees (KM 1 million casino, KM 600,000 betting).</w:t>
+              <w:t xml:space="preserve">Federation: licence guarantee or dedicated deposit KM 1,000,000 casino, KM 600,000 betting (Arts. 71, 93; not online-specific); online player funds at a bank on segregated accounts, shortfall covered within 5 days, shielded from the operator's creditors (Pravilnik Art. 31). RS: bank balance must always cover player funds (Art. 89); fee KM 300,000, guarantee 25% of annual fee costs (Arts. 17, 85).</w:t>
             </w:r>
           </w:p>
         </w:tc>
@@ -22094,7 +22094,7 @@
                 <w:sz w:val="14"/>
                 <w:szCs w:val="14"/>
               </w:rPr>
-              <w:t xml:space="preserve">Federation: direct online link to the Tax Administration. Each entity runs its own regime.</w:t>
+              <w:t xml:space="preserve">Federation: direct on-line link to the Tax Administration server (Art. 82); internet system linked to its central office as one separate payment point (Pravilnik Art. 6); payouts of KM 10,000 or more logged (Art. 8); paid tickets kept 1 year (Art. 87). RS: real-time access, data kept in RS, fee return by the 15th monthly, receipts records 5 years (Arts. 14, 87, 94). AML records 10 years (Art. 92).</w:t>
             </w:r>
           </w:p>
         </w:tc>
@@ -23799,7 +23799,7 @@
                 <w:sz w:val="14"/>
                 <w:szCs w:val="14"/>
               </w:rPr>
-              <w:t xml:space="preserve">Philippines — PAGCOR; AMLC; BSP</w:t>
+              <w:t xml:space="preserve">Philippines — PAGCOR (Electronic Gaming Licensing Dept) licenses e-games, e-bingo, sports betting and their online platforms; its PASED supervises AML compliance. AMLC is the FIU; casinos incl. internet-based casinos are covered persons (RA 10927). BSP licenses and supervises payment providers (BSFIs: banks, digital banks, NBFIs, EMIs) and is consulted on accredited payment SSPs (Annex E, 4 Jun 2026).</w:t>
             </w:r>
           </w:p>
         </w:tc>
@@ -23825,7 +23825,7 @@
                 <w:sz w:val="14"/>
                 <w:szCs w:val="14"/>
               </w:rPr>
-              <w:t xml:space="preserve">Only BSP-licensed payment gateways and channels (PAGCOR, May 2026); e-wallets removed gambling links (August 2025). 2025 BSP draft for a separate capped gambling account not issued (to be confirmed). No virtual-asset rules.</w:t>
+              <w:t xml:space="preserve">Payment gateway and channel providers are PAGCOR-accredited SSPs; BSP-supervised ones file BSP licences and NRPS/DPS proof and follow AMLC rules (Annex E, 4 Jun 2026). All BSIs must remove in-app gambling access links in 48 hours (M-2025-029, 14 Aug 2025); gambling barred from BSFI digital marketplaces (Circular 1237, 16 Jun 2026). BSP 2025-26 drafts not opened. Virtual assets: no rule found.</w:t>
             </w:r>
           </w:p>
         </w:tc>
@@ -23851,7 +23851,7 @@
                 <w:sz w:val="14"/>
                 <w:szCs w:val="14"/>
               </w:rPr>
-              <w:t xml:space="preserve">Government ID and live selfie before deposits (PAGCOR, 2025). Closed-loop rule not found. BSP draft (September 2026): gambling merchants onboarded only by direct acquirers, not aggregators.</w:t>
+              <w:t xml:space="preserve">One valid government-issued photo ID with full name and date of birth, age 21+, photo stored; first deposit min. PHP 500 (Gaming Venue Operations (GVO) framework, 6 Nov 2025); selfie rule not found in readable texts. Closed-loop rule not found. Delayed payment of winnings or balances is an offence; no payout deadline. Platform losing accreditation: withdrawals only, 60 days (Annex F, Jul 2026).</w:t>
             </w:r>
           </w:p>
         </w:tc>
@@ -23877,7 +23877,7 @@
                 <w:sz w:val="14"/>
                 <w:szCs w:val="14"/>
               </w:rPr>
-              <w:t xml:space="preserve">Casino cash transactions over PHP 5 million within 5 working days; suspicious reports by the next working day (AMLC).</w:t>
+              <w:t xml:space="preserve">Covered transaction for casinos incl. internet-based: a single casino cash transaction above PHP 5 million (RA 10927 s. 3(b)); reports within 5 working days (AMLA s. 9(c)); suspicious transactions of any amount by the next working day (AMLC GoTRACS 2024; text not opened). Operators' internal control rules must cover cash transactions reporting (GVO framework Art. III).</w:t>
             </w:r>
           </w:p>
         </w:tc>
@@ -23903,7 +23903,7 @@
                 <w:sz w:val="14"/>
                 <w:szCs w:val="14"/>
               </w:rPr>
-              <w:t xml:space="preserve">Not found.</w:t>
+              <w:t xml:space="preserve">No segregation, trust or guarantee rule found (GVO framework, Annexes E and F, Offenses and Penalties Rev. 3 searched). Unauthorized deductions from winnings or redeemed balances are penalised; a platform provider whose accreditation is cancelled stays liable for unsettled player funds and keeps the platform open 60 days for withdrawals only (Annex F to the GSA framework, 10 Jul 2026).</w:t>
             </w:r>
           </w:p>
         </w:tc>
@@ -23929,7 +23929,7 @@
                 <w:sz w:val="14"/>
                 <w:szCs w:val="14"/>
               </w:rPr>
-              <w:t xml:space="preserve">Connection to PAGCOR’s central monitoring with real-time access. Retention 5 years.</w:t>
+              <w:t xml:space="preserve">Platform providers must integrate with PAGCOR's third-party audit platform (Offenses and Penalties Rev. 3, 6 Nov 2025); real-time access rule not found in readable texts. Records of gaming operations and financial records available to the PAGCOR Monitoring Team at no cost. Retention: books and records at least 6 years (GVO framework Art. XIX); AML records 5 years (AMLA s. 9(b)); CCTV 30 days.</w:t>
             </w:r>
           </w:p>
         </w:tc>
@@ -23994,7 +23994,7 @@
                 <w:sz w:val="14"/>
                 <w:szCs w:val="14"/>
               </w:rPr>
-              <w:t xml:space="preserve">South Africa — National Gambling Board and provincial authorities; FIC</w:t>
+              <w:t xml:space="preserve">South Africa — National Gambling Board (National Gambling Act 7 of 2004); nine provincial licensing authorities with exclusive jurisdiction in their provinces (s. 30), including the Western Cape Gambling and Racing Board (Western Cape Gambling and Racing Act 4 of 1996) and the Eastern Cape Gambling Board (Gambling Act 5 of 1997 (Eastern Cape)); Financial Intelligence Centre (FIC Act 38 of 2001, Schedule 1 item 9).</w:t>
             </w:r>
           </w:p>
         </w:tc>
@@ -24020,7 +24020,7 @@
                 <w:sz w:val="14"/>
                 <w:szCs w:val="14"/>
               </w:rPr>
-              <w:t xml:space="preserve">Online limited to bookmakers licensed by the provinces; vouchers and pay-by-bank common. Betting websites and apps need prior board approval (Western Cape, Eastern Cape). Virtual assets not addressed in gambling law.</w:t>
+              <w:t xml:space="preserve">Online limited to betting with provincially licensed bookmakers; other interactive games unlawful (National Gambling Act s. 11); the National Gambling Amendment Act 10 of 2008 was never brought into operation and the National Gambling Amendment Bill B27-2018 remains unresolved (NCOP rejection, mediation committee 2025). Supreme Court of Appeal, 21 October 2025: Gauteng-licensed bookmakers may not offer fixed-odds bets on roulette outcomes (Portapa v Casino Association of South Africa); the Western Cape Board states the judgment has no bearing in the Western Cape (statement 5 November 2025). Cash widely used; most winnings paid in cash or by EFT; bookmakers take EFT deposits (FIC sector risk assessment, January 2024); no primary source on vouchers found. Betting websites, apps and devices need the Board's prior approval (Western Cape Racing and Betting Rules rule 37; Eastern Cape Betting Rules rule 36.1); wagering systems certified to SANS 1718 Part IV (Western Cape Bookmakers Operational Rules 2017). No rule on virtual assets found in the National Gambling Act, the Western Cape and Eastern Cape instruments or the FIC gambling-sector assessment.</w:t>
             </w:r>
           </w:p>
         </w:tc>
@@ -24046,7 +24046,7 @@
                 <w:sz w:val="14"/>
                 <w:szCs w:val="14"/>
               </w:rPr>
-              <w:t xml:space="preserve">Accounts opened in the customer’s name (provincial rules); Western Cape and Eastern Cape require an ID copy and proof of address. Eastern Cape pays winnings subject to FIC Act checks. No national closed-loop rule found.</w:t>
+              <w:t xml:space="preserve">Western Cape: an account is one opened in the name of the customer by the bookmaker (Bookmakers Operational Rules 2017); bookmaker backups record each account player's name, a copy of the ID, driver's licence or passport, residential address and account number (Racing and Betting Rules rule 17(4)); signed copy of betting limits before telephone or electronic betting (rule 12(4)); winning bets payable immediately after the official result (rule 10); winnings to be claimed within 90 days. Eastern Cape: certified ID copy and residential address supported by documents (Betting Rules rule 19.4); winnings paid only once FIC Act requirements are met (rule 9); website terms must set out the procedure for opening deposit accounts (rule 36.1). Credit betting allowed with a signed credit instrument (Western Cape Regulations reg 45). No closed-loop or own-account payout rule found in the National Gambling Act or the Western Cape and Eastern Cape instruments.</w:t>
             </w:r>
           </w:p>
         </w:tc>
@@ -24072,7 +24072,7 @@
                 <w:sz w:val="14"/>
                 <w:szCs w:val="14"/>
               </w:rPr>
-              <w:t xml:space="preserve">Cash threshold reports from R49,999.99 within 3 days; suspicious transaction reports within 15 days, through goAML. Risk-based due diligence. National 20% tax on online gambling revenue proposed (Treasury, November 2025).</w:t>
+              <w:t xml:space="preserve">FIC Act: cash threshold reports for cash above R49,999.99 (reg 22B, since 14 November 2022) within 3 business days; suspicious and unusual transaction reports within 15 business days (reg 24; days exclude Saturdays, Sundays and public holidays); terrorist property reports within 5 business days; all through the FIC's goAML portal (reg 22). Risk-based customer due diligence under the institution's Risk Management and Compliance Programme (s. 42). Western Cape: cash or negotiable-instrument transactions over R25,000, including deposits for gambling, recorded with the patron's identity and copies sent to the Board within 14 days after month end (Regulations regs 47-48, licensed operators). National online gambling tax proposed by National Treasury (discussion paper, 25 November 2025; comments closed 30 January 2026; reported rate 20% of gross gambling revenue in addition to provincial taxes); not enacted as at 8 October 2026.</w:t>
             </w:r>
           </w:p>
         </w:tc>
@@ -24098,7 +24098,7 @@
                 <w:sz w:val="14"/>
                 <w:szCs w:val="14"/>
               </w:rPr>
-              <w:t xml:space="preserve">Set by provincial conditions; not uniform. No segregation rule found in the Western Cape or Eastern Cape betting rules.</w:t>
+              <w:t xml:space="preserve">No rule or published condition on holding or segregating bookmaker customer balances found in the Western Cape instruments opened (Act to s. 39, Regulations, General Rules 2003, Racing and Betting Rules 2014, Bookmakers Operational Rules 2017) or in the Eastern Cape Betting Rules 2017. The Western Cape minimum bankroll rule applies to casino operators only (reg 63, land-based). The Western Cape Act lets the Board attach licence conditions and require security before operations (ss. 37, 39).</w:t>
             </w:r>
           </w:p>
         </w:tc>
@@ -24124,7 +24124,7 @@
                 <w:sz w:val="14"/>
                 <w:szCs w:val="14"/>
               </w:rPr>
-              <w:t xml:space="preserve">Reporting to the provinces (Eastern Cape: monthly data backups by the 10th); the national monitoring system covers limited payout machines only. Retention 5 years (FIC Act and provincial betting rules).</w:t>
+              <w:t xml:space="preserve">Reporting to the provincial boards. Western Cape: monthly copy of computerised backups to the Board before the 15th unless the Board has remote access (Racing and Betting Rules rule 17(3)); weekly bookmaker return by Thursday (Regulations reg 70); audited annual financial statements within 120 days of year end (reg 43); other returns as the Board determines (reg 44); R25,000 transaction records within 14 days after month end (reg 48); system failures within 24 hours (rule 20). FIC risk and compliance returns (Directive 6 of 2023). Eastern Cape: monthly backups before the 10th (Betting Rules rule 19.3). The national central electronic monitoring system monitors limited pay-out machines (National Gambling Act s. 27). Retention: FIC Act records at least 5 years (s. 23); Western Cape books, accounts and records at least 5 years (reg 40) and backups, registers, ticket and field books 5 years (rules 17(3), 31(8)); Eastern Cape backups 5 years (rule 19.3).</w:t>
             </w:r>
           </w:p>
         </w:tc>
@@ -24812,7 +24812,7 @@
                 <w:sz w:val="14"/>
                 <w:szCs w:val="14"/>
               </w:rPr>
-              <w:t xml:space="preserve">Botswana — Gambling Authority</w:t>
+              <w:t xml:space="preserve">Botswana — Gambling Authority (Gambling Act 2012, Cap. 19:03; supervisory authority for casinos under the Financial Intelligence Act 2022, Sch. II); Financial Intelligence Agency (FIU, goAML); NBFIRA licenses virtual-asset service providers (Virtual Assets Act 2025).</w:t>
             </w:r>
           </w:p>
         </w:tc>
@@ -24839,7 +24839,7 @@
                 <w:sz w:val="14"/>
                 <w:szCs w:val="14"/>
               </w:rPr>
-              <w:t xml:space="preserve">Online sports betting under local bookmaker licences since 2025; offshore sites blocked. Mobile money and cards. Virtual-asset providers licensed by NBFIRA (2022 Act); no gambling rule on virtual assets found.</w:t>
+              <w:t xml:space="preserve">No remote regime in the Act: a bookmaker's licence covers fixed bets on sporting events on the licensed premises (s.82(1)); six bookmaker licensees listed, online betting under them reported since 2025 (press); no blocking rule. Banking and payment arrangements approved by the Authority, changes within 30 days (Regulations 2016 reg 79); no credit (s.107). Rails not stated; no virtual-asset rule.</w:t>
             </w:r>
           </w:p>
         </w:tc>
@@ -24866,7 +24866,7 @@
                 <w:sz w:val="14"/>
                 <w:szCs w:val="14"/>
               </w:rPr>
-              <w:t xml:space="preserve">Identity verification and access controls required of bookmakers; no closed-loop rule found.</w:t>
+              <w:t xml:space="preserve">Minors (under 21; Bill 2026 would set 18) barred from casino gambling areas (s.108); excluded persons kept off licensed premises and machines (s.109(8); regs 89-92). No player identity verification, access-control or closed-loop rule for bookmakers found (Act, Regulations 2016, Bill 2026). Casinos only: no cheque or fund transfer for cash or chips unless the patron genuinely gambled (reg 27(2)).</w:t>
             </w:r>
           </w:p>
         </w:tc>
@@ -24893,7 +24893,7 @@
                 <w:sz w:val="14"/>
                 <w:szCs w:val="14"/>
               </w:rPr>
-              <w:t xml:space="preserve">Cash transactions of P10,000 or more reported to the FIA; suspicious reports through goAML (Financial Intelligence Act 2022). A 2026 amendment bill aligning gambling with FATF standards passed in August 2026 (assent to be confirmed).</w:t>
+              <w:t xml:space="preserve">Casinos are specified parties (FI Act 2022 Sch. I; bookmakers not listed); any business reports suspicions (s.40). CDD at P10,000 (FI Regulations 2022 reg 4); cash transactions of P10,000 or more reported (reg 20); suspicious and cash reports within 5 working days via goAML (regs 21-22). Casinos log transactions above P25,000 (reg 28). Gambling (Amendment) Bill 15 of 2026 (FATF) not in force.</w:t>
             </w:r>
           </w:p>
         </w:tc>
@@ -24920,7 +24920,7 @@
                 <w:sz w:val="14"/>
                 <w:szCs w:val="14"/>
               </w:rPr>
-              <w:t xml:space="preserve">Not found.</w:t>
+              <w:t xml:space="preserve">No segregation or guarantee rule for bookmakers or online activity found (Act, Regulations 2016, Bill 2026). Casinos only: the applicant gives a guarantee or deposits security the Authority considers adequate for obligations to persons gambling in the establishment (s.37(1)(g)).</w:t>
             </w:r>
           </w:p>
         </w:tc>
@@ -24947,7 +24947,7 @@
                 <w:sz w:val="14"/>
                 <w:szCs w:val="14"/>
               </w:rPr>
-              <w:t xml:space="preserve">Amendment bill links most licensees’ machines to the Authority’s monitoring system; casinos and bingo run their own. Online feed not found. Retention 20 years (Financial Intelligence Act 2022).</w:t>
+              <w:t xml:space="preserve">Gambling machine licensees link machines to the Authority's central monitoring system; casinos and bingo install their own (s.96; Bill 2026 cl. 26 widens this, not in force). Online data feed not found. Monthly levy within 10 days of month end (s.50; Sch. 15: casinos 10%, bingo 8%, bookmakers 6.5%). Retention: FIA records 20 years (s.32, casinos; reg 18); casino monitoring data 5 years (reg 30).</w:t>
             </w:r>
           </w:p>
         </w:tc>
@@ -25996,7 +25996,7 @@
                 <w:sz w:val="14"/>
                 <w:szCs w:val="14"/>
               </w:rPr>
-              <w:t xml:space="preserve">Curaçao — Curaçao Gaming Authority</w:t>
+              <w:t xml:space="preserve">Curaçao — Curacao Gaming Authority (CGA, Stichting Gaming Control Board; LOK art. 1.1, 12.1), also AML/CFT supervisor for the gaming sector since 15 Feb 2019 (LB 19/0282, 19/0283). FIU Curacao receives unusual transaction reports (LMOT art. 2, 11). Ministerial responsibility for the LOK and the CGA mandated to the Minister of Justice (P.B. 2025/167, 13 Nov 2025).</w:t>
             </w:r>
           </w:p>
         </w:tc>
@@ -26022,7 +26022,7 @@
                 <w:sz w:val="14"/>
                 <w:szCs w:val="14"/>
               </w:rPr>
-              <w:t xml:space="preserve">Fiat, and virtual assets traded on licensed exchanges; no currency exchange; winnings paid in the currency used. Crypto policy (2026): analytics screening, segregated wallets, same-wallet and same-asset withdrawals by default; transition in four steps, with policy upload by September 2026 and the last steps due December 2026 and June 2027.</w:t>
+              <w:t xml:space="preserve">Fiat tradable internationally; virtual currencies tradable on licensed exchanges; no currency exchange; prizes paid in the currency played (licence conditions art. 9). Crypto policy guideline (June 2026): analytics screening in and out; player, operational and treasury wallets segregated; same-wallet same-asset withdrawals by default; four steps: now, Sep 2026 (portal offline), Dec 2026, Jun 2027.</w:t>
             </w:r>
           </w:p>
         </w:tc>
@@ -26048,7 +26048,7 @@
                 <w:sz w:val="14"/>
                 <w:szCs w:val="14"/>
               </w:rPr>
-              <w:t xml:space="preserve">Players must play on their own behalf; play for third parties to be detected.</w:t>
+              <w:t xml:space="preserve">Players register to play and transact on their own behalf; play for third parties to be detected (CGA AML Regulations III.2.2). All payments between licensee and player only through the player account (licence conditions art. 9.1). T&amp;C guideline (Apr 2026, in force within 6 months): funds returned only to the account they came from. Prizes available 30 months. No own-name instrument rule found.</w:t>
             </w:r>
           </w:p>
         </w:tc>
@@ -26074,7 +26074,7 @@
                 <w:sz w:val="14"/>
                 <w:szCs w:val="14"/>
               </w:rPr>
-              <w:t xml:space="preserve">Due diligence at NAf 4,000 per gaming day across deposits and withdrawals; unusual transactions from NAf 5,000, including series, to the FIU through goAML. The Caribbean guilder (XCG) replaced the NAf at 1:1.</w:t>
+              <w:t xml:space="preserve">CDD at NAf 4,000 (XCG 4,000) of a player's transactions, calculated daily across deposits and withdrawals (CGA AML Regulations III.1, III.3; LID art. 2b(d)). Unusual transactions from XCG 5,000 (NAf 5,000 before 31 Mar 2025), single or series per gaming day, prize payouts included; to FIU Curacao via goAML, in English, without delay; objective reports within 48 h (FIU). XCG replaced NAf 1:1.</w:t>
             </w:r>
           </w:p>
         </w:tc>
@@ -26100,7 +26100,7 @@
                 <w:sz w:val="14"/>
                 <w:szCs w:val="14"/>
               </w:rPr>
-              <w:t xml:space="preserve">Separate account for player deposits and winnings; ring-fencing.</w:t>
+              <w:t xml:space="preserve">Sufficient funds at all times to pay prizes, with ring-fencing and segregation; separate account for player deposits and winnings (licence conditions art. 6.5, 9.2). LOK art. 5.7: guarantee fund for player balances (implementing decree not found); art. 5.8(g): CGA may require segregation, reservation or insurance of balances. Crypto: player funds in segregated wallets of the licensee.</w:t>
             </w:r>
           </w:p>
         </w:tc>
@@ -26126,7 +26126,7 @@
                 <w:sz w:val="14"/>
                 <w:szCs w:val="14"/>
               </w:rPr>
-              <w:t xml:space="preserve">Incidents through the CGA portal without delay; critical data accessible from a Tier-IV data centre in Curaçao. Retention 5 years.</w:t>
+              <w:t xml:space="preserve">Incident report within 24 h (LOK art. 5.10(6); licence condition 13.3); portal mandatory from Jan 2026, offline since Sep 2026 and not returning (7 Oct 2026), channel pending. Change report by 15 Jun and 15 Jan (art. 5.10(4)); complaints report 15 Jan and 15 Jun; player transaction report, cadence set by CGA. Critical data on a Tier-IV server in Curacao (art. 5.9(1)(j)). AML records 5 years.</w:t>
             </w:r>
           </w:p>
         </w:tc>
@@ -26158,7 +26158,7 @@
                 <w:sz w:val="14"/>
                 <w:szCs w:val="14"/>
               </w:rPr>
-              <w:t xml:space="preserve">Brazil — Secretaria de Prêmios e Apostas; COAF</w:t>
+              <w:t xml:space="preserve">Brazil — Secretaria de Prêmios e Apostas (SPA/MF); COAF (Siscoaf segment 'SPA - Apostas de quota fixa'); Banco Central do Brasil (payment rails). MP 1.394/2026 (25 Sept 2026) prohibits fixed-odds betting; authorisations extinguished 25 Oct 2026; the SPA supervises the wind-down; Comitê Interinstitucional (Casa Civil) against illegal offer.</w:t>
             </w:r>
           </w:p>
         </w:tc>
@@ -26185,7 +26185,7 @@
                 <w:sz w:val="14"/>
                 <w:szCs w:val="14"/>
               </w:rPr>
-              <w:t xml:space="preserve">Pix, TED, debit and prepaid cards and book transfers only, through institutions authorised by the Central Bank; cash, boletos, cheques, credit cards and virtual assets prohibited.</w:t>
+              <w:t xml:space="preserve">Transfers only between the bettor's registered account and the operator's transactional account at BCB-authorised institutions; Pix, TED, debit and prepaid cards and book transfer allowed; cash, boleto, cheques, virtual assets, credit/post-paid and third-party payments prohibited (Portaria SPA/MF 615/2024 art. 3). From 25 Sept 2026 no betting payments except wind-down (MP 1.394 art. 14).</w:t>
             </w:r>
           </w:p>
         </w:tc>
@@ -26212,7 +26212,7 @@
                 <w:sz w:val="14"/>
                 <w:szCs w:val="14"/>
               </w:rPr>
-              <w:t xml:space="preserve">Deposits only from a pre-registered account in the bettor’s name (CPF); withdrawals to such an account within 120 minutes. Welfare-recipient screening against SIGAP.</w:t>
+              <w:t xml:space="preserve">Deposits only from a pre-registered account in the bettor's name (max three; others returned); prizes and withdrawals to that account in 120 minutes, hold only on fraud suspicion; CPF-keyed. Bolsa Família/BPC beneficiaries barred; SIGAP checks at registration, first daily login, every 15 days (IN 22/2025). No deposits from 25 Sept 2026, sites off 5 Oct, refunds in 7 days (MP 1.394 arts 7-9).</w:t>
             </w:r>
           </w:p>
         </w:tc>
@@ -26239,7 +26239,7 @@
                 <w:sz w:val="14"/>
                 <w:szCs w:val="14"/>
               </w:rPr>
-              <w:t xml:space="preserve">Suspicion-based reports to COAF by the next business day after analysis; annual nil declaration.</w:t>
+              <w:t xml:space="preserve">Suspicion-based reports to COAF through Siscoaf (segment 'SPA - Apostas de quota fixa', from 1 Jan 2025); no fixed R$ threshold; report by the next business day after the analysis; annual nil declaration to the SPA via SIGAP (Portaria SPA/MF 1.143/2024 arts 27, 30). AML duties survive the extinction of authorisations (MP 1.394 art. 10).</w:t>
             </w:r>
           </w:p>
         </w:tc>
@@ -26266,7 +26266,7 @@
                 <w:sz w:val="14"/>
                 <w:szCs w:val="14"/>
               </w:rPr>
-              <w:t xml:space="preserve">Separate estate covering balances and open bets; R$5 million financial reserve.</w:t>
+              <w:t xml:space="preserve">Bettor funds in transactional accounts; statutory separate estate (Lei 14.790 art. 22) revoked 25 Sept 2026; refund funds stay segregated in those accounts (MP 1.394 art. 8); aggregate balance equal to balances plus open bets (Portaria 615 art. 4 §3); operator gains moved to its own account within 120 minutes; R$5m reserve in federal bonds, R$30m minimum capital (Portaria 827/2024 art. 11).</w:t>
             </w:r>
           </w:p>
         </w:tc>
@@ -26293,7 +26293,7 @@
                 <w:sz w:val="14"/>
                 <w:szCs w:val="14"/>
               </w:rPr>
-              <w:t xml:space="preserve">SIGAP: signed XML files daily (D+2) and monthly, cross-validated. Retention 5 years.</w:t>
+              <w:t xml:space="preserve">SIGAP (Portaria SPA/MF 722/2024 art. 10; Manual rev. 03, 13 Nov 2025): six XML files per XSD, signed with e-CNPJ, daily by 06:00 at D+2, monthly file by the 5th, basic and cross-validation, 3 MB or 7,500 records per file. Continues after extinction (MP 1.394 art. 11; Portaria 3.005/2026 arts 3-5: balances at 5 Oct 2026 sent by 7 Oct, remaining duties by 15 Dec 2026). Retention 5 years.</w:t>
             </w:r>
           </w:p>
         </w:tc>
@@ -27142,7 +27142,7 @@
                 <w:sz w:val="14"/>
                 <w:szCs w:val="14"/>
               </w:rPr>
-              <w:t xml:space="preserve">Paraguay — CONAJZAR</w:t>
+              <w:t xml:space="preserve">Paraguay — CONAJZAR (Comisión Nacional de Juegos de Azar), since Ley 7438/2025 a deconcentrated body of the tax authority DNIT with functional and administrative autonomy (Ley 1016/1997 art. 4 as amended); Decreto 3846/2025 creates DNIT's Dirección General de Juegos de Azar; SEPRELAD (financial intelligence unit, Ley 1015/97); gaming operators are obliged subjects (Ley 1015/97 art. 13 j).</w:t>
             </w:r>
           </w:p>
         </w:tc>
@@ -27169,7 +27169,7 @@
                 <w:sz w:val="14"/>
                 <w:szCs w:val="14"/>
               </w:rPr>
-              <w:t xml:space="preserve">Law 7438/2025 and Decree 3846/2025 allow online casino and sports betting by tendered concession; CONAJZAR, now within the tax authority (DNIT), may supervise payment processing and order blocking. Online payment rules not found.</w:t>
+              <w:t xml:space="preserve">Ley 1016/1997 as amended by Ley 7438/2025 lists casino online and sports betting (up to 3 concessions) among games awarded by public tender (art. 20); sports betting: one exclusive concessionaire, Daruma SAM S.A. (APOSTA.LA); online casino under CONAJZAR authorisations (Res. 1/2019). CONAJZAR monitors and may block online channels, payment included (art. 6 bis). Payment rules, crypto not found.</w:t>
             </w:r>
           </w:p>
         </w:tc>
@@ -27196,7 +27196,7 @@
                 <w:sz w:val="14"/>
                 <w:szCs w:val="14"/>
               </w:rPr>
-              <w:t xml:space="preserve">Identity document required to take part and transact, online modalities included (SEPRELAD Resolution 258/2020).</w:t>
+              <w:t xml:space="preserve">Identity document required from every client to take part and transact, whatever the modality, with online gaming in scope (Res. SEPRELAD 258/2020 arts 1, 24). Own-name account rule not found. Prizes claimed within 60 working days of the draw; unclaimed prizes to the FONARESS account within 30 working days, no format exempt (art. 19, Ley 7438/2025).</w:t>
             </w:r>
           </w:p>
         </w:tc>
@@ -27223,7 +27223,7 @@
                 <w:sz w:val="14"/>
                 <w:szCs w:val="14"/>
               </w:rPr>
-              <w:t xml:space="preserve">FIU: SEPRELAD. Suspicious reports within 24 hours of being classed as suspicious; nil reports after three months without one; due diligence from 8 minimum wages (to be confirmed).</w:t>
+              <w:t xml:space="preserve">FIU: SEPRELAD; reports via SIRO (gaming sector on SIRO, 2FA from 1 July 2025). Res. SEPRELAD 258/2020: due diligence from 8 minimum wages on bets, chip or credit purchases, prize collection (art. 26); suspicious reports within 24 hours of classification (art. 41); nil report within 10 working days after a quarter without one (art. 45). No fixed-amount report found.</w:t>
             </w:r>
           </w:p>
         </w:tc>
@@ -27250,7 +27250,7 @@
                 <w:sz w:val="14"/>
                 <w:szCs w:val="14"/>
               </w:rPr>
-              <w:t xml:space="preserve">Not found.</w:t>
+              <w:t xml:space="preserve">Player-funds segregation or protection rule not found (Ley 1016/1997 as amended, Decreto 3846/2025, Res. SEPRELAD 258/2020, CONAJZAR pages searched). Concession guarantees exist (bid bond for the whole concession, canon guarantee deposit; Ley 1016/1997 arts 9, 14, text not opened) but secure state revenue, not players.</w:t>
             </w:r>
           </w:p>
         </w:tc>
@@ -27277,7 +27277,7 @@
                 <w:sz w:val="14"/>
                 <w:szCs w:val="14"/>
               </w:rPr>
-              <w:t xml:space="preserve">Gaming systems connected online or in real time to CONAJZAR, certified by independent accredited bodies (Decree 3846/2025). AML records 5 years.</w:t>
+              <w:t xml:space="preserve">Machines and systems homologated by DNIT, connected online or in real time to CONAJZAR where applicable, certified by an ONA-accredited inspection body independent of gaming (Decreto 3846/2025 art. 5, text not opened); CONAJZAR laboratory register (Res. 70/2014: GLI, BMM, SIQ). AML records 5 years (Res. 258/2020 arts 28, 40).</w:t>
             </w:r>
           </w:p>
         </w:tc>
@@ -27470,7 +27470,7 @@
                 <w:sz w:val="14"/>
                 <w:szCs w:val="14"/>
               </w:rPr>
-              <w:t xml:space="preserve">Canada — provincial (AGCO and iGaming Ontario; IGCO British Columbia; AGLC Alberta); FINTRAC</w:t>
+              <w:t xml:space="preserve">Canada — provincial (AGCO and iGaming Ontario; IGCO and British Columbia Lottery Corporation; AGLC Alberta); FINTRAC (federal)</w:t>
             </w:r>
           </w:p>
         </w:tc>
@@ -27497,7 +27497,7 @@
                 <w:sz w:val="14"/>
                 <w:szCs w:val="14"/>
               </w:rPr>
-              <w:t xml:space="preserve">Virtual assets not accepted (Ontario, Alberta); deposits authorised by a financial services provider; no credit. Alberta opened 13 July 2026 under AGLC’s Standards and Requirements for Internet Gaming; British Columbia: online gambling through BCLC’s PlayNow.</w:t>
+              <w:t xml:space="preserve">Virtual assets not accepted (Ontario, Alberta, BC); deposits authorised by a financial services provider; no credit. Alberta opened 13 July 2026 under AGLC’s Standards and Requirements for Internet Gaming; British Columbia: online gambling through BCLC’s PlayNow.</w:t>
             </w:r>
           </w:p>
         </w:tc>
@@ -27524,7 +27524,7 @@
                 <w:sz w:val="14"/>
                 <w:szCs w:val="14"/>
               </w:rPr>
-              <w:t xml:space="preserve">Withdrawals only to an account the player legally holds; no transfers between players (Ontario). Alberta: geolocation blocking VPNs and proxies; source-of-funds corroboration where risk requires.</w:t>
+              <w:t xml:space="preserve">Withdrawals only to an account the player legally holds; no transfers between players (Ontario). Alberta: geolocation blocking VPNs and proxies; source-of-funds corroboration where risk requires. British Columbia: player identity verified and deposits and withdraws only to player’s account</w:t>
             </w:r>
           </w:p>
         </w:tc>
@@ -27551,7 +27551,7 @@
                 <w:sz w:val="14"/>
                 <w:szCs w:val="14"/>
               </w:rPr>
-              <w:t xml:space="preserve">FINTRAC reports from C$10,000 (large cash, large virtual currency, casino disbursement) within 24 hours; suspicious reports as soon as practicable; JSON API. Reporting entity: iGaming Ontario; BCLC; Alberta, AiGC oversees AML (to be confirmed).</w:t>
+              <w:t xml:space="preserve">FINTRAC reports from C$10,000 (large cash, large virtual currency, casino disbursement) within 24 hours; suspicious reports as soon as practicable; JSON API. Reporting entity: iGaming Ontario; BCLC; Alberta, AiGC oversees AML (to be confirmed). BC law requires source of funds and IGCO has regulations to mitigate ML.</w:t>
             </w:r>
           </w:p>
         </w:tc>
@@ -27578,7 +27578,7 @@
                 <w:sz w:val="14"/>
                 <w:szCs w:val="14"/>
               </w:rPr>
-              <w:t xml:space="preserve">Under iGaming Ontario’s oversight (Ontario); annual agreed-upon procedures. Alberta and British Columbia not found.</w:t>
+              <w:t xml:space="preserve">Under iGaming Ontario’s oversight (Ontario); annual agreed-upon procedures. Alberta not found. British Columbia: IGCO regulations prohibiting certain types of buy-ins (virtual currency, funds from money services businesses, and pre-paid cards)</w:t>
             </w:r>
           </w:p>
         </w:tc>
@@ -27605,7 +27605,7 @@
                 <w:sz w:val="14"/>
                 <w:szCs w:val="14"/>
               </w:rPr>
-              <w:t xml:space="preserve">Weekly revenue data to iGaming Ontario; FINTRAC copies to the AGCO. Alberta: financial reporting to AiGC; data outside Canada needs AGLC approval. IGCO (2026, replacing GPEB) regulates BCLC. Retention 5 years.</w:t>
+              <w:t xml:space="preserve">Weekly revenue data to iGaming Ontario; FINTRAC copies to the AGCO. Alberta: financial reporting to AiGC; data outside Canada needs AGLC approval. BC: IGCO regulates BCLC. Reports of potential criminal activity, including ML, made to IGCO with reports retained for 5 years.</w:t>
             </w:r>
           </w:p>
         </w:tc>
@@ -27636,7 +27636,7 @@
                 <w:sz w:val="14"/>
                 <w:szCs w:val="14"/>
               </w:rPr>
-              <w:t xml:space="preserve">United States (New Jersey) — Division of Gaming Enforcement; FinCEN</w:t>
+              <w:t xml:space="preserve">United States (New Jersey) — Division of Gaming Enforcement (Casino Control Act, C.5:12-95.17 et seq., P.L. 2013, c. 27; N.J.A.C. 13:69O); FinCEN (31 CFR 1021; casinos with gross annual gaming revenue over $1 million). Internet gaming only by Atlantic City casino licensees.</w:t>
             </w:r>
           </w:p>
         </w:tc>
@@ -27662,7 +27662,7 @@
                 <w:sz w:val="14"/>
                 <w:szCs w:val="14"/>
               </w:rPr>
-              <w:t xml:space="preserve">Bank account, credit and debit card, cash at the cage, prepaid card, ACH and other means the Division approves; virtual currency and stablecoins not listed, and no approval found.</w:t>
+              <w:t xml:space="preserve">Patron deposit account, credit or debit card, cash or chips at an approved cashiering location, verified non-transferable prepaid card, ACH, promotional credits and winnings, other means the Division approves (13:69O-1.3(d)); gift cards and sports wagering kiosks added 2024-2025 (official text not opened). Virtual currency and stablecoins not listed; no Division approval found.</w:t>
             </w:r>
           </w:p>
         </w:tc>
@@ -27688,7 +27688,7 @@
                 <w:sz w:val="14"/>
                 <w:szCs w:val="14"/>
               </w:rPr>
-              <w:t xml:space="preserve">One non-transferable account per patron; no transfers between patrons; withdrawals to the patron’s verified bank account or prepaid card, or at the cage; refunds to the funding card.</w:t>
+              <w:t xml:space="preserve">One account per patron per Internet gaming intermediary, non-transferable; no transfers between patrons; wagers only up to funds on deposit (C.5:12-95.23). Withdrawals: cash-out at the cage, transfer to the patron's deposit account, verified prepaid card or bank account verified with the bank, other means the Division approves; card deposits refunded to the funding card first (13:69O-1.3).</w:t>
             </w:r>
           </w:p>
         </w:tc>
@@ -27714,7 +27714,7 @@
                 <w:sz w:val="14"/>
                 <w:szCs w:val="14"/>
               </w:rPr>
-              <w:t xml:space="preserve">Currency transaction reports above $10,000 per gaming day; suspicious activity reports from $5,000 within 30 days, through BSA E-Filing.</w:t>
+              <w:t xml:space="preserve">Currency transaction report for cash in or cash out over $10,000 aggregated per gaming day, filed within 15 days; suspicious activity report from $5,000 within 30 days of detection (60 at most); both to FinCEN by BSA E-Filing (31 CFR 1021.311, 1021.313, 1021.320, 1010.306). No separate state threshold report found (13:69D searched in full; 13:69O-1.9 system reports only).</w:t>
             </w:r>
           </w:p>
         </w:tc>
@@ -27740,7 +27740,7 @@
                 <w:sz w:val="14"/>
                 <w:szCs w:val="14"/>
               </w:rPr>
-              <w:t xml:space="preserve">Separate New Jersey bank account at least equal to balances, funds on game and pending withdrawals; monthly attestation.</w:t>
+              <w:t xml:space="preserve">Bank account securing patron Internet gaming funds, FDIC-insured bank with a physical presence in New Jersey unless the Division allows otherwise; balance at least the daily ending cashable balances, funds on game and pending withdrawals; monthly schedule to the Division's Revenue Certification Unit (13:69O-1.3(k), 2024 text; official copy not opened, DGE copy still says 'monthly attestation').</w:t>
             </w:r>
           </w:p>
         </w:tc>
@@ -27766,7 +27766,7 @@
                 <w:sz w:val="14"/>
                 <w:szCs w:val="14"/>
               </w:rPr>
-              <w:t xml:space="preserve">Regulator queries and exports system data; servers in Atlantic City. Account data 10 years; BSA records 5 years. No tribal gaming in the state, so no NIGC role.</w:t>
+              <w:t xml:space="preserve">Division queries and exports all gaming system data in the format it requires (13:69O-1.8(b)); primary gaming equipment in Atlantic City (13:69O-1.2(n); C.5:12-95.20). Game play and account data 10 years (13:69O-1.8(d)); other casino records 5 years (13:69D-1.8(g)); BSA records 5 years (31 CFR 1010.430(d)). Tribal gaming: none found in New Jersey (NIGC state list not opened).</w:t>
             </w:r>
           </w:p>
         </w:tc>
@@ -27966,7 +27966,7 @@
           <w:sz w:val="15"/>
           <w:szCs w:val="15"/>
         </w:rPr>
-        <w:t xml:space="preserve">United Arab Emirates: GCGRA policy paper and Cabinet Resolution 134/2025 (gcgra.gov.ae). India: Promotion and Regulation of Online Gaming Act 2025 (egazette.gov.in). Philippines: PAGCOR and BSP notices.</w:t>
+        <w:t xml:space="preserve">United Arab Emirates: GCGRA policy paper and Cabinet Resolution 134/2025 (gcgra.gov.ae). India: Promotion and Regulation of Online Gaming Act 2025 (egazette.gov.in). Philippines: PAGCOR charter RA 9487; AMLA RA 9160 as amended; BSP Circular 1237/2026 and Memorandum M-2025-029.</w:t>
       </w:r>
     </w:p>
     <w:p>
@@ -27984,7 +27984,7 @@
           <w:sz w:val="15"/>
           <w:szCs w:val="15"/>
         </w:rPr>
-        <w:t xml:space="preserve">South Africa: National Gambling Act 2004; FIC guidance. Malawi: Gaming and Lotteries Act 2022; Money Laundering Regulations 2020. Kenya: Gambling Control Act 2025; draft regulations 2026 (gra.go.ke). Nigeria: Supreme Court SC/1/2008; LSLGA notices. Ghana, Botswana, Zimbabwe, Eswatini, Lesotho, Angola, Tanzania, Uganda: regulator and FIU sites; CMS Expert Guide to Gambling Laws in Africa.</w:t>
+        <w:t xml:space="preserve">South Africa: National Gambling Act 2004; Western Cape Gambling and Racing Act; FIC Act guidance and Directive 6/2023. Botswana: Gambling Act 2012; Bank of Botswana AML regulations (reg 4, regs 20-22). Malawi: Gaming and Lotteries Act 2022; Money Laundering Regulations 2020. Kenya: Gambling Control Act 2025; draft regulations 2026 (gra.go.ke). Nigeria: Supreme Court SC/1/2008; LSLGA notices. Ghana, Zimbabwe, Eswatini, Lesotho, Angola, Tanzania, Uganda: regulator and FIU sites; CMS Expert Guide to Gambling Laws in Africa.</w:t>
       </w:r>
     </w:p>
     <w:p>
@@ -28002,7 +28002,7 @@
           <w:sz w:val="15"/>
           <w:szCs w:val="15"/>
         </w:rPr>
-        <w:t xml:space="preserve">Curaçao: National Ordinance on Games of Chance (2024); CGA AML/CFT Regulations (2025); CGA crypto policy guideline (2026). Brazil: Law 14,790/2023; SPA/MF Ordinances 615, 722, 827, 1,143 and 1,231 of 2024; SIGAP manual. Argentina: UIF Resolution 194/2023; IPLyC Resolution 791/2019.</w:t>
+        <w:t xml:space="preserve">Curaçao: National Ordinance on Games of Chance (2024); CGA AML/CFT Regulations (2025); CGA crypto policy guideline (2026). Brazil: Law 14,790/2023; Medida Provisória 1.394/2026; SPA/MF Ordinances 615, 827, 1,143 of 2024, 3,005 of 2026; Normative Instruction 22/2025; SIGAP manual (in.gov.br). Argentina: UIF Resolution 194/2023; IPLyC Resolution 791/2019. Paraguay: Ley 1016/1997 as amended by Ley 7438/2025 (bacn.gov.py); Decreto 3846/2025; Res. SEPRELAD 258/2020.</w:t>
       </w:r>
     </w:p>
     <w:p>
@@ -28038,7 +28038,7 @@
           <w:sz w:val="15"/>
           <w:szCs w:val="15"/>
         </w:rPr>
-        <w:t xml:space="preserve">Canada: AGCO Registrar’s Standards for Internet Gaming; FINTRAC guidance and reporting API; BC Gaming Control Act. United States: N.J.A.C. 13:69O (nj.gov); 31 CFR Part 1021 (ecfr.gov).</w:t>
+        <w:t xml:space="preserve">Canada: AGCO Registrar’s Standards for Internet Gaming; FINTRAC guidance and reporting API; BC Gaming Control Act, S.B.C. 2022, c. 29 and B.C. Reg. 218/2025 (bclaws.gov.bc.ca); AGLC Standards for Regulated Interactive Gaming (2026). United States: N.J.A.C. 13:69O and 13:69D; 31 CFR Part 1021 (ecfr.gov).</w:t>
       </w:r>
     </w:p>
     <w:p>

</xml_diff>